<commit_message>
Your commit message here
</commit_message>
<xml_diff>
--- a/Documentaion/Requirements.docx
+++ b/Documentaion/Requirements.docx
@@ -5,6 +5,7 @@
     <w:p>
       <w:pPr>
         <w:spacing w:line="360" w:lineRule="auto"/>
+        <w:jc w:val="both"/>
         <w:rPr>
           <w:rFonts w:ascii="Arial" w:hAnsi="Arial" w:cs="Arial"/>
         </w:rPr>
@@ -19,6 +20,7 @@
     <w:p>
       <w:pPr>
         <w:spacing w:line="360" w:lineRule="auto"/>
+        <w:jc w:val="both"/>
         <w:rPr>
           <w:rFonts w:ascii="Arial" w:hAnsi="Arial" w:cs="Arial"/>
         </w:rPr>
@@ -33,14 +35,16 @@
     <w:p>
       <w:pPr>
         <w:spacing w:line="360" w:lineRule="auto"/>
-        <w:rPr>
-          <w:rFonts w:ascii="Arial" w:hAnsi="Arial" w:cs="Arial"/>
-        </w:rPr>
-      </w:pPr>
-    </w:p>
-    <w:p>
-      <w:pPr>
-        <w:spacing w:line="360" w:lineRule="auto"/>
+        <w:jc w:val="both"/>
+        <w:rPr>
+          <w:rFonts w:ascii="Arial" w:hAnsi="Arial" w:cs="Arial"/>
+        </w:rPr>
+      </w:pPr>
+    </w:p>
+    <w:p>
+      <w:pPr>
+        <w:spacing w:line="360" w:lineRule="auto"/>
+        <w:jc w:val="both"/>
         <w:rPr>
           <w:rFonts w:ascii="Arial" w:hAnsi="Arial" w:cs="Arial"/>
         </w:rPr>
@@ -59,6 +63,7 @@
           <w:numId w:val="16"/>
         </w:numPr>
         <w:spacing w:line="360" w:lineRule="auto"/>
+        <w:jc w:val="both"/>
         <w:rPr>
           <w:rFonts w:ascii="Arial" w:hAnsi="Arial" w:cs="Arial"/>
         </w:rPr>
@@ -77,6 +82,7 @@
           <w:numId w:val="16"/>
         </w:numPr>
         <w:spacing w:line="360" w:lineRule="auto"/>
+        <w:jc w:val="both"/>
         <w:rPr>
           <w:rFonts w:ascii="Arial" w:hAnsi="Arial" w:cs="Arial"/>
         </w:rPr>
@@ -91,6 +97,7 @@
     <w:p>
       <w:pPr>
         <w:spacing w:line="360" w:lineRule="auto"/>
+        <w:jc w:val="both"/>
         <w:rPr>
           <w:rFonts w:ascii="Arial" w:hAnsi="Arial" w:cs="Arial"/>
         </w:rPr>
@@ -109,6 +116,7 @@
           <w:numId w:val="17"/>
         </w:numPr>
         <w:spacing w:line="360" w:lineRule="auto"/>
+        <w:jc w:val="both"/>
         <w:rPr>
           <w:rFonts w:ascii="Arial" w:hAnsi="Arial" w:cs="Arial"/>
         </w:rPr>
@@ -127,6 +135,7 @@
           <w:numId w:val="17"/>
         </w:numPr>
         <w:spacing w:line="360" w:lineRule="auto"/>
+        <w:jc w:val="both"/>
         <w:rPr>
           <w:rFonts w:ascii="Arial" w:hAnsi="Arial" w:cs="Arial"/>
         </w:rPr>
@@ -143,6 +152,7 @@
     <w:p>
       <w:pPr>
         <w:spacing w:line="360" w:lineRule="auto"/>
+        <w:jc w:val="both"/>
         <w:rPr>
           <w:rFonts w:ascii="Arial" w:hAnsi="Arial" w:cs="Arial"/>
         </w:rPr>
@@ -161,6 +171,7 @@
           <w:numId w:val="18"/>
         </w:numPr>
         <w:spacing w:line="360" w:lineRule="auto"/>
+        <w:jc w:val="both"/>
         <w:rPr>
           <w:rFonts w:ascii="Arial" w:hAnsi="Arial" w:cs="Arial"/>
         </w:rPr>
@@ -179,6 +190,7 @@
           <w:numId w:val="18"/>
         </w:numPr>
         <w:spacing w:line="360" w:lineRule="auto"/>
+        <w:jc w:val="both"/>
         <w:rPr>
           <w:rFonts w:ascii="Arial" w:hAnsi="Arial" w:cs="Arial"/>
         </w:rPr>
@@ -193,6 +205,7 @@
     <w:p>
       <w:pPr>
         <w:spacing w:line="360" w:lineRule="auto"/>
+        <w:jc w:val="both"/>
         <w:rPr>
           <w:rFonts w:ascii="Arial" w:hAnsi="Arial" w:cs="Arial"/>
         </w:rPr>
@@ -211,6 +224,7 @@
           <w:numId w:val="19"/>
         </w:numPr>
         <w:spacing w:line="360" w:lineRule="auto"/>
+        <w:jc w:val="both"/>
         <w:rPr>
           <w:rFonts w:ascii="Arial" w:hAnsi="Arial" w:cs="Arial"/>
         </w:rPr>
@@ -229,6 +243,22 @@
           <w:numId w:val="19"/>
         </w:numPr>
         <w:spacing w:line="360" w:lineRule="auto"/>
+        <w:jc w:val="both"/>
+        <w:rPr>
+          <w:rFonts w:ascii="Arial" w:hAnsi="Arial" w:cs="Arial"/>
+        </w:rPr>
+      </w:pPr>
+      <w:r>
+        <w:rPr>
+          <w:rFonts w:ascii="Arial" w:hAnsi="Arial" w:cs="Arial"/>
+        </w:rPr>
+        <w:t>Link: https://www.researchgate.net/publication/308627965_Exploration_of_Web_front-end_development_technology_and_optimization_direction</w:t>
+      </w:r>
+    </w:p>
+    <w:p>
+      <w:pPr>
+        <w:spacing w:line="360" w:lineRule="auto"/>
+        <w:jc w:val="both"/>
         <w:rPr>
           <w:rFonts w:ascii="Arial" w:hAnsi="Arial" w:cs="Arial"/>
         </w:rPr>
@@ -238,20 +268,6 @@
           <w:rFonts w:ascii="Arial" w:hAnsi="Arial" w:cs="Arial"/>
         </w:rPr>
         <w:lastRenderedPageBreak/>
-        <w:t>Link: https://www.researchgate.net/publication/308627965_Exploration_of_Web_front-end_development_technology_and_optimization_direction</w:t>
-      </w:r>
-    </w:p>
-    <w:p>
-      <w:pPr>
-        <w:spacing w:line="360" w:lineRule="auto"/>
-        <w:rPr>
-          <w:rFonts w:ascii="Arial" w:hAnsi="Arial" w:cs="Arial"/>
-        </w:rPr>
-      </w:pPr>
-      <w:r>
-        <w:rPr>
-          <w:rFonts w:ascii="Arial" w:hAnsi="Arial" w:cs="Arial"/>
-        </w:rPr>
         <w:t>5. "Web Development via HTML, CSS, and JavaScript"</w:t>
       </w:r>
     </w:p>
@@ -262,6 +278,7 @@
           <w:numId w:val="20"/>
         </w:numPr>
         <w:spacing w:line="360" w:lineRule="auto"/>
+        <w:jc w:val="both"/>
         <w:rPr>
           <w:rFonts w:ascii="Arial" w:hAnsi="Arial" w:cs="Arial"/>
         </w:rPr>
@@ -280,6 +297,7 @@
           <w:numId w:val="20"/>
         </w:numPr>
         <w:spacing w:line="360" w:lineRule="auto"/>
+        <w:jc w:val="both"/>
         <w:rPr>
           <w:rFonts w:ascii="Arial" w:hAnsi="Arial" w:cs="Arial"/>
         </w:rPr>
@@ -294,6 +312,7 @@
     <w:p>
       <w:pPr>
         <w:spacing w:line="360" w:lineRule="auto"/>
+        <w:jc w:val="both"/>
         <w:rPr>
           <w:rFonts w:ascii="Arial" w:hAnsi="Arial" w:cs="Arial"/>
         </w:rPr>
@@ -312,6 +331,7 @@
           <w:numId w:val="21"/>
         </w:numPr>
         <w:spacing w:line="360" w:lineRule="auto"/>
+        <w:jc w:val="both"/>
         <w:rPr>
           <w:rFonts w:ascii="Arial" w:hAnsi="Arial" w:cs="Arial"/>
         </w:rPr>
@@ -330,6 +350,7 @@
           <w:numId w:val="21"/>
         </w:numPr>
         <w:spacing w:line="360" w:lineRule="auto"/>
+        <w:jc w:val="both"/>
         <w:rPr>
           <w:rFonts w:ascii="Arial" w:hAnsi="Arial" w:cs="Arial"/>
         </w:rPr>
@@ -344,118 +365,160 @@
     <w:p>
       <w:pPr>
         <w:spacing w:line="360" w:lineRule="auto"/>
-        <w:rPr>
-          <w:rFonts w:ascii="Arial" w:hAnsi="Arial" w:cs="Arial"/>
-        </w:rPr>
-      </w:pPr>
-    </w:p>
-    <w:p>
-      <w:pPr>
-        <w:spacing w:line="360" w:lineRule="auto"/>
-        <w:rPr>
-          <w:rFonts w:ascii="Arial" w:hAnsi="Arial" w:cs="Arial"/>
-        </w:rPr>
-      </w:pPr>
-    </w:p>
-    <w:p>
-      <w:pPr>
-        <w:spacing w:line="360" w:lineRule="auto"/>
-        <w:rPr>
-          <w:rFonts w:ascii="Arial" w:hAnsi="Arial" w:cs="Arial"/>
-        </w:rPr>
-      </w:pPr>
-    </w:p>
-    <w:p>
-      <w:pPr>
-        <w:spacing w:line="360" w:lineRule="auto"/>
-        <w:rPr>
-          <w:rFonts w:ascii="Arial" w:hAnsi="Arial" w:cs="Arial"/>
-        </w:rPr>
-      </w:pPr>
-    </w:p>
-    <w:p>
-      <w:pPr>
-        <w:spacing w:line="360" w:lineRule="auto"/>
-        <w:rPr>
-          <w:rFonts w:ascii="Arial" w:hAnsi="Arial" w:cs="Arial"/>
-        </w:rPr>
-      </w:pPr>
-    </w:p>
-    <w:p>
-      <w:pPr>
-        <w:spacing w:line="360" w:lineRule="auto"/>
-        <w:rPr>
-          <w:rFonts w:ascii="Arial" w:hAnsi="Arial" w:cs="Arial"/>
-        </w:rPr>
-      </w:pPr>
-    </w:p>
-    <w:p>
-      <w:pPr>
-        <w:spacing w:line="360" w:lineRule="auto"/>
-        <w:rPr>
-          <w:rFonts w:ascii="Arial" w:hAnsi="Arial" w:cs="Arial"/>
-        </w:rPr>
-      </w:pPr>
-    </w:p>
-    <w:p>
-      <w:pPr>
-        <w:spacing w:line="360" w:lineRule="auto"/>
-        <w:rPr>
-          <w:rFonts w:ascii="Arial" w:hAnsi="Arial" w:cs="Arial"/>
-        </w:rPr>
-      </w:pPr>
-    </w:p>
-    <w:p>
-      <w:pPr>
-        <w:spacing w:line="360" w:lineRule="auto"/>
-        <w:rPr>
-          <w:rFonts w:ascii="Arial" w:hAnsi="Arial" w:cs="Arial"/>
-        </w:rPr>
-      </w:pPr>
-    </w:p>
-    <w:p>
-      <w:pPr>
-        <w:spacing w:line="360" w:lineRule="auto"/>
-        <w:rPr>
-          <w:rFonts w:ascii="Arial" w:hAnsi="Arial" w:cs="Arial"/>
-        </w:rPr>
-      </w:pPr>
-    </w:p>
-    <w:p>
-      <w:pPr>
-        <w:spacing w:line="360" w:lineRule="auto"/>
-        <w:rPr>
-          <w:rFonts w:ascii="Arial" w:hAnsi="Arial" w:cs="Arial"/>
-        </w:rPr>
-      </w:pPr>
-    </w:p>
-    <w:p>
-      <w:pPr>
-        <w:spacing w:line="360" w:lineRule="auto"/>
-        <w:rPr>
-          <w:rFonts w:ascii="Arial" w:hAnsi="Arial" w:cs="Arial"/>
-        </w:rPr>
-      </w:pPr>
-    </w:p>
-    <w:p>
-      <w:pPr>
-        <w:spacing w:line="360" w:lineRule="auto"/>
-        <w:rPr>
-          <w:rFonts w:ascii="Arial" w:hAnsi="Arial" w:cs="Arial"/>
-        </w:rPr>
-      </w:pPr>
-    </w:p>
-    <w:p>
-      <w:pPr>
-        <w:spacing w:line="360" w:lineRule="auto"/>
-        <w:rPr>
-          <w:rFonts w:ascii="Arial" w:hAnsi="Arial" w:cs="Arial"/>
-        </w:rPr>
-      </w:pPr>
-    </w:p>
-    <w:p>
-      <w:pPr>
-        <w:spacing w:line="360" w:lineRule="auto"/>
+        <w:jc w:val="both"/>
+        <w:rPr>
+          <w:rFonts w:ascii="Arial" w:hAnsi="Arial" w:cs="Arial"/>
+        </w:rPr>
+      </w:pPr>
+    </w:p>
+    <w:p>
+      <w:pPr>
+        <w:spacing w:line="360" w:lineRule="auto"/>
+        <w:jc w:val="both"/>
+        <w:rPr>
+          <w:rFonts w:ascii="Arial" w:hAnsi="Arial" w:cs="Arial"/>
+        </w:rPr>
+      </w:pPr>
+    </w:p>
+    <w:p>
+      <w:pPr>
+        <w:spacing w:line="360" w:lineRule="auto"/>
+        <w:jc w:val="both"/>
+        <w:rPr>
+          <w:rFonts w:ascii="Arial" w:hAnsi="Arial" w:cs="Arial"/>
+        </w:rPr>
+      </w:pPr>
+    </w:p>
+    <w:p>
+      <w:pPr>
+        <w:spacing w:line="360" w:lineRule="auto"/>
+        <w:jc w:val="both"/>
+        <w:rPr>
+          <w:rFonts w:ascii="Arial" w:hAnsi="Arial" w:cs="Arial"/>
+        </w:rPr>
+      </w:pPr>
+    </w:p>
+    <w:p>
+      <w:pPr>
+        <w:spacing w:line="360" w:lineRule="auto"/>
+        <w:jc w:val="both"/>
+        <w:rPr>
+          <w:rFonts w:ascii="Arial" w:hAnsi="Arial" w:cs="Arial"/>
+        </w:rPr>
+      </w:pPr>
+    </w:p>
+    <w:p>
+      <w:pPr>
+        <w:spacing w:line="360" w:lineRule="auto"/>
+        <w:jc w:val="both"/>
+        <w:rPr>
+          <w:rFonts w:ascii="Arial" w:hAnsi="Arial" w:cs="Arial"/>
+        </w:rPr>
+      </w:pPr>
+    </w:p>
+    <w:p>
+      <w:pPr>
+        <w:spacing w:line="360" w:lineRule="auto"/>
+        <w:jc w:val="both"/>
+        <w:rPr>
+          <w:rFonts w:ascii="Arial" w:hAnsi="Arial" w:cs="Arial"/>
+        </w:rPr>
+      </w:pPr>
+    </w:p>
+    <w:p>
+      <w:pPr>
+        <w:spacing w:line="360" w:lineRule="auto"/>
+        <w:jc w:val="both"/>
+        <w:rPr>
+          <w:rFonts w:ascii="Arial" w:hAnsi="Arial" w:cs="Arial"/>
+        </w:rPr>
+      </w:pPr>
+    </w:p>
+    <w:p>
+      <w:pPr>
+        <w:spacing w:line="360" w:lineRule="auto"/>
+        <w:jc w:val="both"/>
+        <w:rPr>
+          <w:rFonts w:ascii="Arial" w:hAnsi="Arial" w:cs="Arial"/>
+        </w:rPr>
+      </w:pPr>
+    </w:p>
+    <w:p>
+      <w:pPr>
+        <w:spacing w:line="360" w:lineRule="auto"/>
+        <w:jc w:val="both"/>
+        <w:rPr>
+          <w:rFonts w:ascii="Arial" w:hAnsi="Arial" w:cs="Arial"/>
+        </w:rPr>
+      </w:pPr>
+    </w:p>
+    <w:p>
+      <w:pPr>
+        <w:spacing w:line="360" w:lineRule="auto"/>
+        <w:jc w:val="both"/>
+        <w:rPr>
+          <w:rFonts w:ascii="Arial" w:hAnsi="Arial" w:cs="Arial"/>
+        </w:rPr>
+      </w:pPr>
+    </w:p>
+    <w:p>
+      <w:pPr>
+        <w:spacing w:line="360" w:lineRule="auto"/>
+        <w:jc w:val="both"/>
+        <w:rPr>
+          <w:rFonts w:ascii="Arial" w:hAnsi="Arial" w:cs="Arial"/>
+        </w:rPr>
+      </w:pPr>
+    </w:p>
+    <w:p>
+      <w:pPr>
+        <w:spacing w:line="360" w:lineRule="auto"/>
+        <w:jc w:val="both"/>
+        <w:rPr>
+          <w:rFonts w:ascii="Arial" w:hAnsi="Arial" w:cs="Arial"/>
+        </w:rPr>
+      </w:pPr>
+    </w:p>
+    <w:p>
+      <w:pPr>
+        <w:spacing w:line="360" w:lineRule="auto"/>
+        <w:jc w:val="both"/>
+        <w:rPr>
+          <w:rFonts w:ascii="Arial" w:hAnsi="Arial" w:cs="Arial"/>
+        </w:rPr>
+      </w:pPr>
+    </w:p>
+    <w:p>
+      <w:pPr>
+        <w:spacing w:line="360" w:lineRule="auto"/>
+        <w:jc w:val="both"/>
+        <w:rPr>
+          <w:rFonts w:ascii="Arial" w:hAnsi="Arial" w:cs="Arial"/>
+        </w:rPr>
+      </w:pPr>
+    </w:p>
+    <w:p>
+      <w:pPr>
+        <w:spacing w:line="360" w:lineRule="auto"/>
+        <w:jc w:val="both"/>
+        <w:rPr>
+          <w:rFonts w:ascii="Arial" w:hAnsi="Arial" w:cs="Arial"/>
+        </w:rPr>
+      </w:pPr>
+    </w:p>
+    <w:p>
+      <w:pPr>
+        <w:spacing w:line="360" w:lineRule="auto"/>
+        <w:jc w:val="both"/>
+        <w:rPr>
+          <w:rFonts w:ascii="Arial" w:hAnsi="Arial" w:cs="Arial"/>
+        </w:rPr>
+      </w:pPr>
+    </w:p>
+    <w:p>
+      <w:pPr>
+        <w:spacing w:line="360" w:lineRule="auto"/>
+        <w:jc w:val="both"/>
         <w:rPr>
           <w:rFonts w:ascii="Arial" w:hAnsi="Arial" w:cs="Arial"/>
         </w:rPr>
@@ -471,6 +534,7 @@
     <w:p>
       <w:pPr>
         <w:spacing w:line="360" w:lineRule="auto"/>
+        <w:jc w:val="both"/>
         <w:rPr>
           <w:rFonts w:ascii="Arial" w:hAnsi="Arial" w:cs="Arial"/>
         </w:rPr>
@@ -485,6 +549,7 @@
     <w:p>
       <w:pPr>
         <w:spacing w:line="360" w:lineRule="auto"/>
+        <w:jc w:val="both"/>
         <w:rPr>
           <w:rFonts w:ascii="Arial" w:hAnsi="Arial" w:cs="Arial"/>
         </w:rPr>
@@ -503,6 +568,7 @@
           <w:numId w:val="1"/>
         </w:numPr>
         <w:spacing w:line="360" w:lineRule="auto"/>
+        <w:jc w:val="both"/>
         <w:rPr>
           <w:rFonts w:ascii="Arial" w:hAnsi="Arial" w:cs="Arial"/>
         </w:rPr>
@@ -521,6 +587,7 @@
           <w:numId w:val="1"/>
         </w:numPr>
         <w:spacing w:line="360" w:lineRule="auto"/>
+        <w:jc w:val="both"/>
         <w:rPr>
           <w:rFonts w:ascii="Arial" w:hAnsi="Arial" w:cs="Arial"/>
         </w:rPr>
@@ -539,6 +606,7 @@
           <w:numId w:val="1"/>
         </w:numPr>
         <w:spacing w:line="360" w:lineRule="auto"/>
+        <w:jc w:val="both"/>
         <w:rPr>
           <w:rFonts w:ascii="Arial" w:hAnsi="Arial" w:cs="Arial"/>
         </w:rPr>
@@ -557,6 +625,7 @@
           <w:numId w:val="1"/>
         </w:numPr>
         <w:spacing w:line="360" w:lineRule="auto"/>
+        <w:jc w:val="both"/>
         <w:rPr>
           <w:rFonts w:ascii="Arial" w:hAnsi="Arial" w:cs="Arial"/>
         </w:rPr>
@@ -575,6 +644,7 @@
           <w:numId w:val="1"/>
         </w:numPr>
         <w:spacing w:line="360" w:lineRule="auto"/>
+        <w:jc w:val="both"/>
         <w:rPr>
           <w:rFonts w:ascii="Arial" w:hAnsi="Arial" w:cs="Arial"/>
         </w:rPr>
@@ -593,6 +663,7 @@
           <w:numId w:val="1"/>
         </w:numPr>
         <w:spacing w:line="360" w:lineRule="auto"/>
+        <w:jc w:val="both"/>
         <w:rPr>
           <w:rFonts w:ascii="Arial" w:hAnsi="Arial" w:cs="Arial"/>
         </w:rPr>
@@ -611,6 +682,7 @@
           <w:numId w:val="1"/>
         </w:numPr>
         <w:spacing w:line="360" w:lineRule="auto"/>
+        <w:jc w:val="both"/>
         <w:rPr>
           <w:rFonts w:ascii="Arial" w:hAnsi="Arial" w:cs="Arial"/>
         </w:rPr>
@@ -625,6 +697,7 @@
     <w:p>
       <w:pPr>
         <w:spacing w:line="360" w:lineRule="auto"/>
+        <w:jc w:val="both"/>
         <w:rPr>
           <w:rFonts w:ascii="Arial" w:hAnsi="Arial" w:cs="Arial"/>
         </w:rPr>
@@ -643,6 +716,7 @@
           <w:numId w:val="2"/>
         </w:numPr>
         <w:spacing w:line="360" w:lineRule="auto"/>
+        <w:jc w:val="both"/>
         <w:rPr>
           <w:rFonts w:ascii="Arial" w:hAnsi="Arial" w:cs="Arial"/>
         </w:rPr>
@@ -661,6 +735,7 @@
           <w:numId w:val="2"/>
         </w:numPr>
         <w:spacing w:line="360" w:lineRule="auto"/>
+        <w:jc w:val="both"/>
         <w:rPr>
           <w:rFonts w:ascii="Arial" w:hAnsi="Arial" w:cs="Arial"/>
         </w:rPr>
@@ -679,6 +754,7 @@
           <w:numId w:val="2"/>
         </w:numPr>
         <w:spacing w:line="360" w:lineRule="auto"/>
+        <w:jc w:val="both"/>
         <w:rPr>
           <w:rFonts w:ascii="Arial" w:hAnsi="Arial" w:cs="Arial"/>
         </w:rPr>
@@ -697,6 +773,7 @@
           <w:numId w:val="2"/>
         </w:numPr>
         <w:spacing w:line="360" w:lineRule="auto"/>
+        <w:jc w:val="both"/>
         <w:rPr>
           <w:rFonts w:ascii="Arial" w:hAnsi="Arial" w:cs="Arial"/>
         </w:rPr>
@@ -715,6 +792,7 @@
           <w:numId w:val="2"/>
         </w:numPr>
         <w:spacing w:line="360" w:lineRule="auto"/>
+        <w:jc w:val="both"/>
         <w:rPr>
           <w:rFonts w:ascii="Arial" w:hAnsi="Arial" w:cs="Arial"/>
         </w:rPr>
@@ -733,6 +811,7 @@
           <w:numId w:val="2"/>
         </w:numPr>
         <w:spacing w:line="360" w:lineRule="auto"/>
+        <w:jc w:val="both"/>
         <w:rPr>
           <w:rFonts w:ascii="Arial" w:hAnsi="Arial" w:cs="Arial"/>
         </w:rPr>
@@ -747,6 +826,7 @@
     <w:p>
       <w:pPr>
         <w:spacing w:line="360" w:lineRule="auto"/>
+        <w:jc w:val="both"/>
         <w:rPr>
           <w:rFonts w:ascii="Arial" w:hAnsi="Arial" w:cs="Arial"/>
         </w:rPr>
@@ -765,6 +845,7 @@
           <w:numId w:val="3"/>
         </w:numPr>
         <w:spacing w:line="360" w:lineRule="auto"/>
+        <w:jc w:val="both"/>
         <w:rPr>
           <w:rFonts w:ascii="Arial" w:hAnsi="Arial" w:cs="Arial"/>
         </w:rPr>
@@ -786,6 +867,7 @@
           <w:numId w:val="3"/>
         </w:numPr>
         <w:spacing w:line="360" w:lineRule="auto"/>
+        <w:jc w:val="both"/>
         <w:rPr>
           <w:rFonts w:ascii="Arial" w:hAnsi="Arial" w:cs="Arial"/>
         </w:rPr>
@@ -803,6 +885,7 @@
     <w:p>
       <w:pPr>
         <w:spacing w:line="360" w:lineRule="auto"/>
+        <w:jc w:val="both"/>
         <w:rPr>
           <w:rFonts w:ascii="Arial" w:hAnsi="Arial" w:cs="Arial"/>
         </w:rPr>
@@ -812,13 +895,14 @@
           <w:rFonts w:ascii="Arial" w:hAnsi="Arial" w:cs="Arial"/>
         </w:rPr>
         <w:pict w14:anchorId="52DCA0D3">
-          <v:rect id="_x0000_i1026" style="width:0;height:1.5pt" o:hralign="center" o:hrstd="t" o:hr="t" fillcolor="#a0a0a0" stroked="f"/>
+          <v:rect id="_x0000_i1025" style="width:0;height:1.5pt" o:hralign="center" o:hrstd="t" o:hr="t" fillcolor="#a0a0a0" stroked="f"/>
         </w:pict>
       </w:r>
     </w:p>
     <w:p>
       <w:pPr>
         <w:spacing w:line="360" w:lineRule="auto"/>
+        <w:jc w:val="both"/>
         <w:rPr>
           <w:rFonts w:ascii="Arial" w:hAnsi="Arial" w:cs="Arial"/>
         </w:rPr>
@@ -847,6 +931,7 @@
     <w:p>
       <w:pPr>
         <w:spacing w:line="360" w:lineRule="auto"/>
+        <w:jc w:val="both"/>
         <w:rPr>
           <w:rFonts w:ascii="Arial" w:hAnsi="Arial" w:cs="Arial"/>
         </w:rPr>
@@ -875,6 +960,7 @@
     <w:p>
       <w:pPr>
         <w:spacing w:line="360" w:lineRule="auto"/>
+        <w:jc w:val="both"/>
         <w:rPr>
           <w:rFonts w:ascii="Arial" w:hAnsi="Arial" w:cs="Arial"/>
         </w:rPr>
@@ -893,6 +979,7 @@
           <w:numId w:val="4"/>
         </w:numPr>
         <w:spacing w:line="360" w:lineRule="auto"/>
+        <w:jc w:val="both"/>
         <w:rPr>
           <w:rFonts w:ascii="Arial" w:hAnsi="Arial" w:cs="Arial"/>
         </w:rPr>
@@ -911,6 +998,7 @@
           <w:numId w:val="4"/>
         </w:numPr>
         <w:spacing w:line="360" w:lineRule="auto"/>
+        <w:jc w:val="both"/>
         <w:rPr>
           <w:rFonts w:ascii="Arial" w:hAnsi="Arial" w:cs="Arial"/>
         </w:rPr>
@@ -929,6 +1017,7 @@
           <w:numId w:val="4"/>
         </w:numPr>
         <w:spacing w:line="360" w:lineRule="auto"/>
+        <w:jc w:val="both"/>
         <w:rPr>
           <w:rFonts w:ascii="Arial" w:hAnsi="Arial" w:cs="Arial"/>
         </w:rPr>
@@ -947,6 +1036,7 @@
           <w:numId w:val="4"/>
         </w:numPr>
         <w:spacing w:line="360" w:lineRule="auto"/>
+        <w:jc w:val="both"/>
         <w:rPr>
           <w:rFonts w:ascii="Arial" w:hAnsi="Arial" w:cs="Arial"/>
         </w:rPr>
@@ -965,6 +1055,7 @@
           <w:numId w:val="4"/>
         </w:numPr>
         <w:spacing w:line="360" w:lineRule="auto"/>
+        <w:jc w:val="both"/>
         <w:rPr>
           <w:rFonts w:ascii="Arial" w:hAnsi="Arial" w:cs="Arial"/>
         </w:rPr>
@@ -983,6 +1074,7 @@
           <w:numId w:val="4"/>
         </w:numPr>
         <w:spacing w:line="360" w:lineRule="auto"/>
+        <w:jc w:val="both"/>
         <w:rPr>
           <w:rFonts w:ascii="Arial" w:hAnsi="Arial" w:cs="Arial"/>
         </w:rPr>
@@ -997,6 +1089,7 @@
     <w:p>
       <w:pPr>
         <w:spacing w:line="360" w:lineRule="auto"/>
+        <w:jc w:val="both"/>
         <w:rPr>
           <w:rFonts w:ascii="Arial" w:hAnsi="Arial" w:cs="Arial"/>
         </w:rPr>
@@ -1015,6 +1108,7 @@
           <w:numId w:val="5"/>
         </w:numPr>
         <w:spacing w:line="360" w:lineRule="auto"/>
+        <w:jc w:val="both"/>
         <w:rPr>
           <w:rFonts w:ascii="Arial" w:hAnsi="Arial" w:cs="Arial"/>
         </w:rPr>
@@ -1033,6 +1127,7 @@
           <w:numId w:val="5"/>
         </w:numPr>
         <w:spacing w:line="360" w:lineRule="auto"/>
+        <w:jc w:val="both"/>
         <w:rPr>
           <w:rFonts w:ascii="Arial" w:hAnsi="Arial" w:cs="Arial"/>
         </w:rPr>
@@ -1065,6 +1160,7 @@
           <w:numId w:val="5"/>
         </w:numPr>
         <w:spacing w:line="360" w:lineRule="auto"/>
+        <w:jc w:val="both"/>
         <w:rPr>
           <w:rFonts w:ascii="Arial" w:hAnsi="Arial" w:cs="Arial"/>
         </w:rPr>
@@ -1097,6 +1193,7 @@
           <w:numId w:val="5"/>
         </w:numPr>
         <w:spacing w:line="360" w:lineRule="auto"/>
+        <w:jc w:val="both"/>
         <w:rPr>
           <w:rFonts w:ascii="Arial" w:hAnsi="Arial" w:cs="Arial"/>
         </w:rPr>
@@ -1115,6 +1212,7 @@
           <w:numId w:val="5"/>
         </w:numPr>
         <w:spacing w:line="360" w:lineRule="auto"/>
+        <w:jc w:val="both"/>
         <w:rPr>
           <w:rFonts w:ascii="Arial" w:hAnsi="Arial" w:cs="Arial"/>
         </w:rPr>
@@ -1147,6 +1245,7 @@
           <w:numId w:val="5"/>
         </w:numPr>
         <w:spacing w:line="360" w:lineRule="auto"/>
+        <w:jc w:val="both"/>
         <w:rPr>
           <w:rFonts w:ascii="Arial" w:hAnsi="Arial" w:cs="Arial"/>
         </w:rPr>
@@ -1179,6 +1278,36 @@
           <w:numId w:val="5"/>
         </w:numPr>
         <w:spacing w:line="360" w:lineRule="auto"/>
+        <w:jc w:val="both"/>
+        <w:rPr>
+          <w:rFonts w:ascii="Arial" w:hAnsi="Arial" w:cs="Arial"/>
+        </w:rPr>
+      </w:pPr>
+      <w:r>
+        <w:rPr>
+          <w:rFonts w:ascii="Arial" w:hAnsi="Arial" w:cs="Arial"/>
+        </w:rPr>
+        <w:t xml:space="preserve">Sonic Points incorporates KPI-driven solutions, offering insights into user performance, while </w:t>
+      </w:r>
+      <w:proofErr w:type="spellStart"/>
+      <w:r>
+        <w:rPr>
+          <w:rFonts w:ascii="Arial" w:hAnsi="Arial" w:cs="Arial"/>
+        </w:rPr>
+        <w:t>Todoist</w:t>
+      </w:r>
+      <w:proofErr w:type="spellEnd"/>
+      <w:r>
+        <w:rPr>
+          <w:rFonts w:ascii="Arial" w:hAnsi="Arial" w:cs="Arial"/>
+        </w:rPr>
+        <w:t xml:space="preserve"> primarily focuses on task organization and basic productivity metrics.</w:t>
+      </w:r>
+    </w:p>
+    <w:p>
+      <w:pPr>
+        <w:spacing w:line="360" w:lineRule="auto"/>
+        <w:jc w:val="both"/>
         <w:rPr>
           <w:rFonts w:ascii="Arial" w:hAnsi="Arial" w:cs="Arial"/>
         </w:rPr>
@@ -1188,34 +1317,6 @@
           <w:rFonts w:ascii="Arial" w:hAnsi="Arial" w:cs="Arial"/>
         </w:rPr>
         <w:lastRenderedPageBreak/>
-        <w:t xml:space="preserve">Sonic Points incorporates KPI-driven solutions, offering insights into user performance, while </w:t>
-      </w:r>
-      <w:proofErr w:type="spellStart"/>
-      <w:r>
-        <w:rPr>
-          <w:rFonts w:ascii="Arial" w:hAnsi="Arial" w:cs="Arial"/>
-        </w:rPr>
-        <w:t>Todoist</w:t>
-      </w:r>
-      <w:proofErr w:type="spellEnd"/>
-      <w:r>
-        <w:rPr>
-          <w:rFonts w:ascii="Arial" w:hAnsi="Arial" w:cs="Arial"/>
-        </w:rPr>
-        <w:t xml:space="preserve"> primarily focuses on task organization and basic productivity metrics.</w:t>
-      </w:r>
-    </w:p>
-    <w:p>
-      <w:pPr>
-        <w:spacing w:line="360" w:lineRule="auto"/>
-        <w:rPr>
-          <w:rFonts w:ascii="Arial" w:hAnsi="Arial" w:cs="Arial"/>
-        </w:rPr>
-      </w:pPr>
-      <w:r>
-        <w:rPr>
-          <w:rFonts w:ascii="Arial" w:hAnsi="Arial" w:cs="Arial"/>
-        </w:rPr>
         <w:t>References:</w:t>
       </w:r>
     </w:p>
@@ -1226,6 +1327,7 @@
           <w:numId w:val="6"/>
         </w:numPr>
         <w:spacing w:line="360" w:lineRule="auto"/>
+        <w:jc w:val="both"/>
         <w:rPr>
           <w:rFonts w:ascii="Arial" w:hAnsi="Arial" w:cs="Arial"/>
         </w:rPr>
@@ -1256,6 +1358,7 @@
           <w:numId w:val="6"/>
         </w:numPr>
         <w:spacing w:line="360" w:lineRule="auto"/>
+        <w:jc w:val="both"/>
         <w:rPr>
           <w:rFonts w:ascii="Arial" w:hAnsi="Arial" w:cs="Arial"/>
         </w:rPr>
@@ -1282,14 +1385,16 @@
     <w:p>
       <w:pPr>
         <w:spacing w:line="360" w:lineRule="auto"/>
-        <w:rPr>
-          <w:rFonts w:ascii="Arial" w:hAnsi="Arial" w:cs="Arial"/>
-        </w:rPr>
-      </w:pPr>
-    </w:p>
-    <w:p>
-      <w:pPr>
-        <w:spacing w:line="360" w:lineRule="auto"/>
+        <w:jc w:val="both"/>
+        <w:rPr>
+          <w:rFonts w:ascii="Arial" w:hAnsi="Arial" w:cs="Arial"/>
+        </w:rPr>
+      </w:pPr>
+    </w:p>
+    <w:p>
+      <w:pPr>
+        <w:spacing w:line="360" w:lineRule="auto"/>
+        <w:jc w:val="both"/>
         <w:rPr>
           <w:rFonts w:ascii="Arial" w:hAnsi="Arial" w:cs="Arial"/>
         </w:rPr>
@@ -1304,6 +1409,7 @@
     <w:p>
       <w:pPr>
         <w:spacing w:line="360" w:lineRule="auto"/>
+        <w:jc w:val="both"/>
         <w:rPr>
           <w:rFonts w:ascii="Arial" w:hAnsi="Arial" w:cs="Arial"/>
         </w:rPr>
@@ -1318,6 +1424,7 @@
     <w:p>
       <w:pPr>
         <w:spacing w:line="360" w:lineRule="auto"/>
+        <w:jc w:val="both"/>
         <w:rPr>
           <w:rFonts w:ascii="Arial" w:hAnsi="Arial" w:cs="Arial"/>
         </w:rPr>
@@ -1336,6 +1443,7 @@
           <w:numId w:val="7"/>
         </w:numPr>
         <w:spacing w:line="360" w:lineRule="auto"/>
+        <w:jc w:val="both"/>
         <w:rPr>
           <w:rFonts w:ascii="Arial" w:hAnsi="Arial" w:cs="Arial"/>
         </w:rPr>
@@ -1354,6 +1462,7 @@
           <w:numId w:val="7"/>
         </w:numPr>
         <w:spacing w:line="360" w:lineRule="auto"/>
+        <w:jc w:val="both"/>
         <w:rPr>
           <w:rFonts w:ascii="Arial" w:hAnsi="Arial" w:cs="Arial"/>
         </w:rPr>
@@ -1372,6 +1481,7 @@
           <w:numId w:val="7"/>
         </w:numPr>
         <w:spacing w:line="360" w:lineRule="auto"/>
+        <w:jc w:val="both"/>
         <w:rPr>
           <w:rFonts w:ascii="Arial" w:hAnsi="Arial" w:cs="Arial"/>
         </w:rPr>
@@ -1390,6 +1500,7 @@
           <w:numId w:val="7"/>
         </w:numPr>
         <w:spacing w:line="360" w:lineRule="auto"/>
+        <w:jc w:val="both"/>
         <w:rPr>
           <w:rFonts w:ascii="Arial" w:hAnsi="Arial" w:cs="Arial"/>
         </w:rPr>
@@ -1408,6 +1519,7 @@
           <w:numId w:val="7"/>
         </w:numPr>
         <w:spacing w:line="360" w:lineRule="auto"/>
+        <w:jc w:val="both"/>
         <w:rPr>
           <w:rFonts w:ascii="Arial" w:hAnsi="Arial" w:cs="Arial"/>
         </w:rPr>
@@ -1426,6 +1538,7 @@
           <w:numId w:val="7"/>
         </w:numPr>
         <w:spacing w:line="360" w:lineRule="auto"/>
+        <w:jc w:val="both"/>
         <w:rPr>
           <w:rFonts w:ascii="Arial" w:hAnsi="Arial" w:cs="Arial"/>
         </w:rPr>
@@ -1444,6 +1557,7 @@
           <w:numId w:val="7"/>
         </w:numPr>
         <w:spacing w:line="360" w:lineRule="auto"/>
+        <w:jc w:val="both"/>
         <w:rPr>
           <w:rFonts w:ascii="Arial" w:hAnsi="Arial" w:cs="Arial"/>
         </w:rPr>
@@ -1458,6 +1572,7 @@
     <w:p>
       <w:pPr>
         <w:spacing w:line="360" w:lineRule="auto"/>
+        <w:jc w:val="both"/>
         <w:rPr>
           <w:rFonts w:ascii="Arial" w:hAnsi="Arial" w:cs="Arial"/>
         </w:rPr>
@@ -1476,6 +1591,7 @@
           <w:numId w:val="8"/>
         </w:numPr>
         <w:spacing w:line="360" w:lineRule="auto"/>
+        <w:jc w:val="both"/>
         <w:rPr>
           <w:rFonts w:ascii="Arial" w:hAnsi="Arial" w:cs="Arial"/>
         </w:rPr>
@@ -1494,6 +1610,7 @@
           <w:numId w:val="8"/>
         </w:numPr>
         <w:spacing w:line="360" w:lineRule="auto"/>
+        <w:jc w:val="both"/>
         <w:rPr>
           <w:rFonts w:ascii="Arial" w:hAnsi="Arial" w:cs="Arial"/>
         </w:rPr>
@@ -1512,6 +1629,7 @@
           <w:numId w:val="8"/>
         </w:numPr>
         <w:spacing w:line="360" w:lineRule="auto"/>
+        <w:jc w:val="both"/>
         <w:rPr>
           <w:rFonts w:ascii="Arial" w:hAnsi="Arial" w:cs="Arial"/>
         </w:rPr>
@@ -1530,6 +1648,7 @@
           <w:numId w:val="8"/>
         </w:numPr>
         <w:spacing w:line="360" w:lineRule="auto"/>
+        <w:jc w:val="both"/>
         <w:rPr>
           <w:rFonts w:ascii="Arial" w:hAnsi="Arial" w:cs="Arial"/>
         </w:rPr>
@@ -1548,15 +1667,15 @@
           <w:numId w:val="8"/>
         </w:numPr>
         <w:spacing w:line="360" w:lineRule="auto"/>
-        <w:rPr>
-          <w:rFonts w:ascii="Arial" w:hAnsi="Arial" w:cs="Arial"/>
-        </w:rPr>
-      </w:pPr>
-      <w:r>
-        <w:rPr>
-          <w:rFonts w:ascii="Arial" w:hAnsi="Arial" w:cs="Arial"/>
-        </w:rPr>
-        <w:lastRenderedPageBreak/>
+        <w:jc w:val="both"/>
+        <w:rPr>
+          <w:rFonts w:ascii="Arial" w:hAnsi="Arial" w:cs="Arial"/>
+        </w:rPr>
+      </w:pPr>
+      <w:r>
+        <w:rPr>
+          <w:rFonts w:ascii="Arial" w:hAnsi="Arial" w:cs="Arial"/>
+        </w:rPr>
         <w:t>Sonic Points stands out by integrating gamification through a leaderboard and a point system, which is not present in Asana.</w:t>
       </w:r>
     </w:p>
@@ -1567,14 +1686,16 @@
           <w:numId w:val="8"/>
         </w:numPr>
         <w:spacing w:line="360" w:lineRule="auto"/>
-        <w:rPr>
-          <w:rFonts w:ascii="Arial" w:hAnsi="Arial" w:cs="Arial"/>
-        </w:rPr>
-      </w:pPr>
-      <w:r>
-        <w:rPr>
-          <w:rFonts w:ascii="Arial" w:hAnsi="Arial" w:cs="Arial"/>
-        </w:rPr>
+        <w:jc w:val="both"/>
+        <w:rPr>
+          <w:rFonts w:ascii="Arial" w:hAnsi="Arial" w:cs="Arial"/>
+        </w:rPr>
+      </w:pPr>
+      <w:r>
+        <w:rPr>
+          <w:rFonts w:ascii="Arial" w:hAnsi="Arial" w:cs="Arial"/>
+        </w:rPr>
+        <w:lastRenderedPageBreak/>
         <w:t>Asana emphasizes team collaboration and project workflows, while Sonic Points is more focused on individual performance and KPIs, encouraging users to measure their progress against personal goals.</w:t>
       </w:r>
     </w:p>
@@ -1585,6 +1706,7 @@
           <w:numId w:val="8"/>
         </w:numPr>
         <w:spacing w:line="360" w:lineRule="auto"/>
+        <w:jc w:val="both"/>
         <w:rPr>
           <w:rFonts w:ascii="Arial" w:hAnsi="Arial" w:cs="Arial"/>
         </w:rPr>
@@ -1599,6 +1721,7 @@
     <w:p>
       <w:pPr>
         <w:spacing w:line="360" w:lineRule="auto"/>
+        <w:jc w:val="both"/>
         <w:rPr>
           <w:rFonts w:ascii="Arial" w:hAnsi="Arial" w:cs="Arial"/>
         </w:rPr>
@@ -1617,6 +1740,7 @@
           <w:numId w:val="9"/>
         </w:numPr>
         <w:spacing w:line="360" w:lineRule="auto"/>
+        <w:jc w:val="both"/>
         <w:rPr>
           <w:rFonts w:ascii="Arial" w:hAnsi="Arial" w:cs="Arial"/>
         </w:rPr>
@@ -1638,6 +1762,7 @@
           <w:numId w:val="9"/>
         </w:numPr>
         <w:spacing w:line="360" w:lineRule="auto"/>
+        <w:jc w:val="both"/>
         <w:rPr>
           <w:rFonts w:ascii="Arial" w:hAnsi="Arial" w:cs="Arial"/>
         </w:rPr>
@@ -1655,14 +1780,16 @@
     <w:p>
       <w:pPr>
         <w:spacing w:line="360" w:lineRule="auto"/>
-        <w:rPr>
-          <w:rFonts w:ascii="Arial" w:hAnsi="Arial" w:cs="Arial"/>
-        </w:rPr>
-      </w:pPr>
-    </w:p>
-    <w:p>
-      <w:pPr>
-        <w:spacing w:line="360" w:lineRule="auto"/>
+        <w:jc w:val="both"/>
+        <w:rPr>
+          <w:rFonts w:ascii="Arial" w:hAnsi="Arial" w:cs="Arial"/>
+        </w:rPr>
+      </w:pPr>
+    </w:p>
+    <w:p>
+      <w:pPr>
+        <w:spacing w:line="360" w:lineRule="auto"/>
+        <w:jc w:val="both"/>
         <w:rPr>
           <w:rFonts w:ascii="Arial" w:hAnsi="Arial" w:cs="Arial"/>
         </w:rPr>
@@ -1691,6 +1818,7 @@
     <w:p>
       <w:pPr>
         <w:spacing w:line="360" w:lineRule="auto"/>
+        <w:jc w:val="both"/>
         <w:rPr>
           <w:rFonts w:ascii="Arial" w:hAnsi="Arial" w:cs="Arial"/>
         </w:rPr>
@@ -1719,6 +1847,7 @@
     <w:p>
       <w:pPr>
         <w:spacing w:line="360" w:lineRule="auto"/>
+        <w:jc w:val="both"/>
         <w:rPr>
           <w:rFonts w:ascii="Arial" w:hAnsi="Arial" w:cs="Arial"/>
         </w:rPr>
@@ -1737,6 +1866,7 @@
           <w:numId w:val="10"/>
         </w:numPr>
         <w:spacing w:line="360" w:lineRule="auto"/>
+        <w:jc w:val="both"/>
         <w:rPr>
           <w:rFonts w:ascii="Arial" w:hAnsi="Arial" w:cs="Arial"/>
         </w:rPr>
@@ -1755,6 +1885,7 @@
           <w:numId w:val="10"/>
         </w:numPr>
         <w:spacing w:line="360" w:lineRule="auto"/>
+        <w:jc w:val="both"/>
         <w:rPr>
           <w:rFonts w:ascii="Arial" w:hAnsi="Arial" w:cs="Arial"/>
         </w:rPr>
@@ -1773,6 +1904,7 @@
           <w:numId w:val="10"/>
         </w:numPr>
         <w:spacing w:line="360" w:lineRule="auto"/>
+        <w:jc w:val="both"/>
         <w:rPr>
           <w:rFonts w:ascii="Arial" w:hAnsi="Arial" w:cs="Arial"/>
         </w:rPr>
@@ -1791,6 +1923,7 @@
           <w:numId w:val="10"/>
         </w:numPr>
         <w:spacing w:line="360" w:lineRule="auto"/>
+        <w:jc w:val="both"/>
         <w:rPr>
           <w:rFonts w:ascii="Arial" w:hAnsi="Arial" w:cs="Arial"/>
         </w:rPr>
@@ -1809,6 +1942,7 @@
           <w:numId w:val="10"/>
         </w:numPr>
         <w:spacing w:line="360" w:lineRule="auto"/>
+        <w:jc w:val="both"/>
         <w:rPr>
           <w:rFonts w:ascii="Arial" w:hAnsi="Arial" w:cs="Arial"/>
         </w:rPr>
@@ -1827,6 +1961,7 @@
           <w:numId w:val="10"/>
         </w:numPr>
         <w:spacing w:line="360" w:lineRule="auto"/>
+        <w:jc w:val="both"/>
         <w:rPr>
           <w:rFonts w:ascii="Arial" w:hAnsi="Arial" w:cs="Arial"/>
         </w:rPr>
@@ -1841,6 +1976,7 @@
     <w:p>
       <w:pPr>
         <w:spacing w:line="360" w:lineRule="auto"/>
+        <w:jc w:val="both"/>
         <w:rPr>
           <w:rFonts w:ascii="Arial" w:hAnsi="Arial" w:cs="Arial"/>
         </w:rPr>
@@ -1859,6 +1995,7 @@
           <w:numId w:val="11"/>
         </w:numPr>
         <w:spacing w:line="360" w:lineRule="auto"/>
+        <w:jc w:val="both"/>
         <w:rPr>
           <w:rFonts w:ascii="Arial" w:hAnsi="Arial" w:cs="Arial"/>
         </w:rPr>
@@ -1877,15 +2014,15 @@
           <w:numId w:val="11"/>
         </w:numPr>
         <w:spacing w:line="360" w:lineRule="auto"/>
-        <w:rPr>
-          <w:rFonts w:ascii="Arial" w:hAnsi="Arial" w:cs="Arial"/>
-        </w:rPr>
-      </w:pPr>
-      <w:r>
-        <w:rPr>
-          <w:rFonts w:ascii="Arial" w:hAnsi="Arial" w:cs="Arial"/>
-        </w:rPr>
-        <w:lastRenderedPageBreak/>
+        <w:jc w:val="both"/>
+        <w:rPr>
+          <w:rFonts w:ascii="Arial" w:hAnsi="Arial" w:cs="Arial"/>
+        </w:rPr>
+      </w:pPr>
+      <w:r>
+        <w:rPr>
+          <w:rFonts w:ascii="Arial" w:hAnsi="Arial" w:cs="Arial"/>
+        </w:rPr>
         <w:t xml:space="preserve">Both </w:t>
       </w:r>
       <w:proofErr w:type="spellStart"/>
@@ -1910,14 +2047,16 @@
           <w:numId w:val="11"/>
         </w:numPr>
         <w:spacing w:line="360" w:lineRule="auto"/>
-        <w:rPr>
-          <w:rFonts w:ascii="Arial" w:hAnsi="Arial" w:cs="Arial"/>
-        </w:rPr>
-      </w:pPr>
-      <w:r>
-        <w:rPr>
-          <w:rFonts w:ascii="Arial" w:hAnsi="Arial" w:cs="Arial"/>
-        </w:rPr>
+        <w:jc w:val="both"/>
+        <w:rPr>
+          <w:rFonts w:ascii="Arial" w:hAnsi="Arial" w:cs="Arial"/>
+        </w:rPr>
+      </w:pPr>
+      <w:r>
+        <w:rPr>
+          <w:rFonts w:ascii="Arial" w:hAnsi="Arial" w:cs="Arial"/>
+        </w:rPr>
+        <w:lastRenderedPageBreak/>
         <w:t>Both platforms allow users to track their progress and provide incentives based on performance.</w:t>
       </w:r>
     </w:p>
@@ -1928,6 +2067,7 @@
           <w:numId w:val="11"/>
         </w:numPr>
         <w:spacing w:line="360" w:lineRule="auto"/>
+        <w:jc w:val="both"/>
         <w:rPr>
           <w:rFonts w:ascii="Arial" w:hAnsi="Arial" w:cs="Arial"/>
         </w:rPr>
@@ -1946,6 +2086,7 @@
           <w:numId w:val="11"/>
         </w:numPr>
         <w:spacing w:line="360" w:lineRule="auto"/>
+        <w:jc w:val="both"/>
         <w:rPr>
           <w:rFonts w:ascii="Arial" w:hAnsi="Arial" w:cs="Arial"/>
         </w:rPr>
@@ -1978,6 +2119,7 @@
           <w:numId w:val="11"/>
         </w:numPr>
         <w:spacing w:line="360" w:lineRule="auto"/>
+        <w:jc w:val="both"/>
         <w:rPr>
           <w:rFonts w:ascii="Arial" w:hAnsi="Arial" w:cs="Arial"/>
         </w:rPr>
@@ -2006,6 +2148,7 @@
     <w:p>
       <w:pPr>
         <w:spacing w:line="360" w:lineRule="auto"/>
+        <w:jc w:val="both"/>
         <w:rPr>
           <w:rFonts w:ascii="Arial" w:hAnsi="Arial" w:cs="Arial"/>
         </w:rPr>
@@ -2024,6 +2167,7 @@
           <w:numId w:val="12"/>
         </w:numPr>
         <w:spacing w:line="360" w:lineRule="auto"/>
+        <w:jc w:val="both"/>
         <w:rPr>
           <w:rFonts w:ascii="Arial" w:hAnsi="Arial" w:cs="Arial"/>
         </w:rPr>
@@ -2054,6 +2198,7 @@
           <w:numId w:val="12"/>
         </w:numPr>
         <w:spacing w:line="360" w:lineRule="auto"/>
+        <w:jc w:val="both"/>
         <w:rPr>
           <w:rFonts w:ascii="Arial" w:hAnsi="Arial" w:cs="Arial"/>
         </w:rPr>
@@ -2080,102 +2225,115 @@
     <w:p>
       <w:pPr>
         <w:spacing w:line="360" w:lineRule="auto"/>
-        <w:rPr>
-          <w:rFonts w:ascii="Arial" w:hAnsi="Arial" w:cs="Arial"/>
-        </w:rPr>
-      </w:pPr>
-    </w:p>
-    <w:p>
-      <w:pPr>
-        <w:spacing w:line="360" w:lineRule="auto"/>
-        <w:rPr>
-          <w:rFonts w:ascii="Arial" w:hAnsi="Arial" w:cs="Arial"/>
-        </w:rPr>
-      </w:pPr>
-    </w:p>
-    <w:p>
-      <w:pPr>
-        <w:spacing w:line="360" w:lineRule="auto"/>
-        <w:rPr>
-          <w:rFonts w:ascii="Arial" w:hAnsi="Arial" w:cs="Arial"/>
-        </w:rPr>
-      </w:pPr>
-    </w:p>
-    <w:p>
-      <w:pPr>
-        <w:spacing w:line="360" w:lineRule="auto"/>
-        <w:rPr>
-          <w:rFonts w:ascii="Arial" w:hAnsi="Arial" w:cs="Arial"/>
-        </w:rPr>
-      </w:pPr>
-    </w:p>
-    <w:p>
-      <w:pPr>
-        <w:spacing w:line="360" w:lineRule="auto"/>
-        <w:rPr>
-          <w:rFonts w:ascii="Arial" w:hAnsi="Arial" w:cs="Arial"/>
-        </w:rPr>
-      </w:pPr>
-    </w:p>
-    <w:p>
-      <w:pPr>
-        <w:spacing w:line="360" w:lineRule="auto"/>
-        <w:rPr>
-          <w:rFonts w:ascii="Arial" w:hAnsi="Arial" w:cs="Arial"/>
-        </w:rPr>
-      </w:pPr>
-    </w:p>
-    <w:p>
-      <w:pPr>
-        <w:spacing w:line="360" w:lineRule="auto"/>
-        <w:rPr>
-          <w:rFonts w:ascii="Arial" w:hAnsi="Arial" w:cs="Arial"/>
-        </w:rPr>
-      </w:pPr>
-    </w:p>
-    <w:p>
-      <w:pPr>
-        <w:spacing w:line="360" w:lineRule="auto"/>
-        <w:rPr>
-          <w:rFonts w:ascii="Arial" w:hAnsi="Arial" w:cs="Arial"/>
-        </w:rPr>
-      </w:pPr>
-    </w:p>
-    <w:p>
-      <w:pPr>
-        <w:spacing w:line="360" w:lineRule="auto"/>
-        <w:rPr>
-          <w:rFonts w:ascii="Arial" w:hAnsi="Arial" w:cs="Arial"/>
-        </w:rPr>
-      </w:pPr>
-    </w:p>
-    <w:p>
-      <w:pPr>
-        <w:spacing w:line="360" w:lineRule="auto"/>
-        <w:rPr>
-          <w:rFonts w:ascii="Arial" w:hAnsi="Arial" w:cs="Arial"/>
-        </w:rPr>
-      </w:pPr>
-    </w:p>
-    <w:p>
-      <w:pPr>
-        <w:spacing w:line="360" w:lineRule="auto"/>
-        <w:rPr>
-          <w:rFonts w:ascii="Arial" w:hAnsi="Arial" w:cs="Arial"/>
-        </w:rPr>
-      </w:pPr>
-    </w:p>
-    <w:p>
-      <w:pPr>
-        <w:spacing w:line="360" w:lineRule="auto"/>
-        <w:rPr>
-          <w:rFonts w:ascii="Arial" w:hAnsi="Arial" w:cs="Arial"/>
-        </w:rPr>
-      </w:pPr>
-    </w:p>
-    <w:p>
-      <w:pPr>
-        <w:spacing w:line="360" w:lineRule="auto"/>
+        <w:jc w:val="both"/>
+        <w:rPr>
+          <w:rFonts w:ascii="Arial" w:hAnsi="Arial" w:cs="Arial"/>
+        </w:rPr>
+      </w:pPr>
+    </w:p>
+    <w:p>
+      <w:pPr>
+        <w:spacing w:line="360" w:lineRule="auto"/>
+        <w:jc w:val="both"/>
+        <w:rPr>
+          <w:rFonts w:ascii="Arial" w:hAnsi="Arial" w:cs="Arial"/>
+        </w:rPr>
+      </w:pPr>
+    </w:p>
+    <w:p>
+      <w:pPr>
+        <w:spacing w:line="360" w:lineRule="auto"/>
+        <w:jc w:val="both"/>
+        <w:rPr>
+          <w:rFonts w:ascii="Arial" w:hAnsi="Arial" w:cs="Arial"/>
+        </w:rPr>
+      </w:pPr>
+    </w:p>
+    <w:p>
+      <w:pPr>
+        <w:spacing w:line="360" w:lineRule="auto"/>
+        <w:jc w:val="both"/>
+        <w:rPr>
+          <w:rFonts w:ascii="Arial" w:hAnsi="Arial" w:cs="Arial"/>
+        </w:rPr>
+      </w:pPr>
+    </w:p>
+    <w:p>
+      <w:pPr>
+        <w:spacing w:line="360" w:lineRule="auto"/>
+        <w:jc w:val="both"/>
+        <w:rPr>
+          <w:rFonts w:ascii="Arial" w:hAnsi="Arial" w:cs="Arial"/>
+        </w:rPr>
+      </w:pPr>
+    </w:p>
+    <w:p>
+      <w:pPr>
+        <w:spacing w:line="360" w:lineRule="auto"/>
+        <w:jc w:val="both"/>
+        <w:rPr>
+          <w:rFonts w:ascii="Arial" w:hAnsi="Arial" w:cs="Arial"/>
+        </w:rPr>
+      </w:pPr>
+    </w:p>
+    <w:p>
+      <w:pPr>
+        <w:spacing w:line="360" w:lineRule="auto"/>
+        <w:jc w:val="both"/>
+        <w:rPr>
+          <w:rFonts w:ascii="Arial" w:hAnsi="Arial" w:cs="Arial"/>
+        </w:rPr>
+      </w:pPr>
+    </w:p>
+    <w:p>
+      <w:pPr>
+        <w:spacing w:line="360" w:lineRule="auto"/>
+        <w:jc w:val="both"/>
+        <w:rPr>
+          <w:rFonts w:ascii="Arial" w:hAnsi="Arial" w:cs="Arial"/>
+        </w:rPr>
+      </w:pPr>
+    </w:p>
+    <w:p>
+      <w:pPr>
+        <w:spacing w:line="360" w:lineRule="auto"/>
+        <w:jc w:val="both"/>
+        <w:rPr>
+          <w:rFonts w:ascii="Arial" w:hAnsi="Arial" w:cs="Arial"/>
+        </w:rPr>
+      </w:pPr>
+    </w:p>
+    <w:p>
+      <w:pPr>
+        <w:spacing w:line="360" w:lineRule="auto"/>
+        <w:jc w:val="both"/>
+        <w:rPr>
+          <w:rFonts w:ascii="Arial" w:hAnsi="Arial" w:cs="Arial"/>
+        </w:rPr>
+      </w:pPr>
+    </w:p>
+    <w:p>
+      <w:pPr>
+        <w:spacing w:line="360" w:lineRule="auto"/>
+        <w:jc w:val="both"/>
+        <w:rPr>
+          <w:rFonts w:ascii="Arial" w:hAnsi="Arial" w:cs="Arial"/>
+        </w:rPr>
+      </w:pPr>
+    </w:p>
+    <w:p>
+      <w:pPr>
+        <w:spacing w:line="360" w:lineRule="auto"/>
+        <w:jc w:val="both"/>
+        <w:rPr>
+          <w:rFonts w:ascii="Arial" w:hAnsi="Arial" w:cs="Arial"/>
+        </w:rPr>
+      </w:pPr>
+    </w:p>
+    <w:p>
+      <w:pPr>
+        <w:spacing w:line="360" w:lineRule="auto"/>
+        <w:jc w:val="both"/>
         <w:rPr>
           <w:rFonts w:ascii="Arial" w:hAnsi="Arial" w:cs="Arial"/>
           <w:b/>
@@ -2188,12 +2346,30 @@
           <w:b/>
           <w:bCs/>
         </w:rPr>
-        <w:lastRenderedPageBreak/>
         <w:t>Dissimilarities:</w:t>
+      </w:r>
+    </w:p>
+    <w:p>
+      <w:pPr>
+        <w:spacing w:line="360" w:lineRule="auto"/>
+        <w:jc w:val="both"/>
+        <w:rPr>
+          <w:rFonts w:ascii="Arial" w:hAnsi="Arial" w:cs="Arial"/>
+        </w:rPr>
+      </w:pPr>
+      <w:r>
+        <w:rPr>
+          <w:rFonts w:ascii="Arial" w:hAnsi="Arial" w:cs="Arial"/>
+        </w:rPr>
+        <w:pict w14:anchorId="2563661D">
+          <v:rect id="_x0000_i1026" style="width:0;height:1.5pt" o:hralign="center" o:hrstd="t" o:hr="t" fillcolor="#a0a0a0" stroked="f"/>
+        </w:pict>
       </w:r>
     </w:p>
     <w:tbl>
       <w:tblPr>
+        <w:tblpPr w:leftFromText="180" w:rightFromText="180" w:vertAnchor="text" w:tblpY="1"/>
+        <w:tblOverlap w:val="never"/>
         <w:tblW w:w="0" w:type="auto"/>
         <w:tblCellSpacing w:w="15" w:type="dxa"/>
         <w:tblCellMar>
@@ -2205,12 +2381,12 @@
         <w:tblLook w:val="04A0" w:firstRow="1" w:lastRow="0" w:firstColumn="1" w:lastColumn="0" w:noHBand="0" w:noVBand="1"/>
       </w:tblPr>
       <w:tblGrid>
-        <w:gridCol w:w="1497"/>
-        <w:gridCol w:w="1540"/>
-        <w:gridCol w:w="1533"/>
-        <w:gridCol w:w="1588"/>
-        <w:gridCol w:w="1581"/>
-        <w:gridCol w:w="1621"/>
+        <w:gridCol w:w="1459"/>
+        <w:gridCol w:w="1560"/>
+        <w:gridCol w:w="1481"/>
+        <w:gridCol w:w="1463"/>
+        <w:gridCol w:w="1539"/>
+        <w:gridCol w:w="1858"/>
       </w:tblGrid>
       <w:tr>
         <w:trPr>
@@ -2226,14 +2402,20 @@
           <w:p>
             <w:pPr>
               <w:spacing w:line="360" w:lineRule="auto"/>
-              <w:rPr>
-                <w:rFonts w:ascii="Arial" w:hAnsi="Arial" w:cs="Arial"/>
+              <w:jc w:val="both"/>
+              <w:rPr>
+                <w:rFonts w:ascii="Arial" w:hAnsi="Arial" w:cs="Arial"/>
+                <w:b/>
+                <w:bCs/>
               </w:rPr>
             </w:pPr>
             <w:r>
               <w:rPr>
                 <w:rFonts w:ascii="Arial" w:hAnsi="Arial" w:cs="Arial"/>
-              </w:rPr>
+                <w:b/>
+                <w:bCs/>
+              </w:rPr>
+              <w:lastRenderedPageBreak/>
               <w:t>Feature</w:t>
             </w:r>
           </w:p>
@@ -2247,13 +2429,18 @@
           <w:p>
             <w:pPr>
               <w:spacing w:line="360" w:lineRule="auto"/>
-              <w:rPr>
-                <w:rFonts w:ascii="Arial" w:hAnsi="Arial" w:cs="Arial"/>
+              <w:jc w:val="both"/>
+              <w:rPr>
+                <w:rFonts w:ascii="Arial" w:hAnsi="Arial" w:cs="Arial"/>
+                <w:b/>
+                <w:bCs/>
               </w:rPr>
             </w:pPr>
             <w:r>
               <w:rPr>
                 <w:rFonts w:ascii="Arial" w:hAnsi="Arial" w:cs="Arial"/>
+                <w:b/>
+                <w:bCs/>
               </w:rPr>
               <w:t>Sonic Points</w:t>
             </w:r>
@@ -2268,13 +2455,18 @@
           <w:p>
             <w:pPr>
               <w:spacing w:line="360" w:lineRule="auto"/>
-              <w:rPr>
-                <w:rFonts w:ascii="Arial" w:hAnsi="Arial" w:cs="Arial"/>
+              <w:jc w:val="both"/>
+              <w:rPr>
+                <w:rFonts w:ascii="Arial" w:hAnsi="Arial" w:cs="Arial"/>
+                <w:b/>
+                <w:bCs/>
               </w:rPr>
             </w:pPr>
             <w:r>
               <w:rPr>
                 <w:rFonts w:ascii="Arial" w:hAnsi="Arial" w:cs="Arial"/>
+                <w:b/>
+                <w:bCs/>
               </w:rPr>
               <w:t>Trello</w:t>
             </w:r>
@@ -2289,14 +2481,19 @@
           <w:p>
             <w:pPr>
               <w:spacing w:line="360" w:lineRule="auto"/>
-              <w:rPr>
-                <w:rFonts w:ascii="Arial" w:hAnsi="Arial" w:cs="Arial"/>
+              <w:jc w:val="both"/>
+              <w:rPr>
+                <w:rFonts w:ascii="Arial" w:hAnsi="Arial" w:cs="Arial"/>
+                <w:b/>
+                <w:bCs/>
               </w:rPr>
             </w:pPr>
             <w:proofErr w:type="spellStart"/>
             <w:r>
               <w:rPr>
                 <w:rFonts w:ascii="Arial" w:hAnsi="Arial" w:cs="Arial"/>
+                <w:b/>
+                <w:bCs/>
               </w:rPr>
               <w:t>Todoist</w:t>
             </w:r>
@@ -2312,13 +2509,18 @@
           <w:p>
             <w:pPr>
               <w:spacing w:line="360" w:lineRule="auto"/>
-              <w:rPr>
-                <w:rFonts w:ascii="Arial" w:hAnsi="Arial" w:cs="Arial"/>
+              <w:jc w:val="both"/>
+              <w:rPr>
+                <w:rFonts w:ascii="Arial" w:hAnsi="Arial" w:cs="Arial"/>
+                <w:b/>
+                <w:bCs/>
               </w:rPr>
             </w:pPr>
             <w:r>
               <w:rPr>
                 <w:rFonts w:ascii="Arial" w:hAnsi="Arial" w:cs="Arial"/>
+                <w:b/>
+                <w:bCs/>
               </w:rPr>
               <w:t>Asana</w:t>
             </w:r>
@@ -2333,148 +2535,20 @@
           <w:p>
             <w:pPr>
               <w:spacing w:line="360" w:lineRule="auto"/>
-              <w:rPr>
-                <w:rFonts w:ascii="Arial" w:hAnsi="Arial" w:cs="Arial"/>
-              </w:rPr>
-            </w:pPr>
-            <w:proofErr w:type="spellStart"/>
-            <w:r>
-              <w:rPr>
-                <w:rFonts w:ascii="Arial" w:hAnsi="Arial" w:cs="Arial"/>
-              </w:rPr>
-              <w:t>Habitica</w:t>
-            </w:r>
-            <w:proofErr w:type="spellEnd"/>
-          </w:p>
-        </w:tc>
-      </w:tr>
-      <w:tr>
-        <w:trPr>
-          <w:tblCellSpacing w:w="15" w:type="dxa"/>
-        </w:trPr>
-        <w:tc>
-          <w:tcPr>
-            <w:tcW w:w="0" w:type="auto"/>
-            <w:vAlign w:val="center"/>
-            <w:hideMark/>
-          </w:tcPr>
-          <w:p>
-            <w:pPr>
-              <w:spacing w:line="360" w:lineRule="auto"/>
-              <w:rPr>
-                <w:rFonts w:ascii="Arial" w:hAnsi="Arial" w:cs="Arial"/>
+              <w:jc w:val="both"/>
+              <w:rPr>
+                <w:rFonts w:ascii="Arial" w:hAnsi="Arial" w:cs="Arial"/>
+                <w:b/>
+                <w:bCs/>
               </w:rPr>
             </w:pPr>
             <w:r>
               <w:rPr>
                 <w:rFonts w:ascii="Arial" w:hAnsi="Arial" w:cs="Arial"/>
-              </w:rPr>
-              <w:t>Gamification</w:t>
-            </w:r>
-          </w:p>
-        </w:tc>
-        <w:tc>
-          <w:tcPr>
-            <w:tcW w:w="0" w:type="auto"/>
-            <w:vAlign w:val="center"/>
-            <w:hideMark/>
-          </w:tcPr>
-          <w:p>
-            <w:pPr>
-              <w:spacing w:line="360" w:lineRule="auto"/>
-              <w:rPr>
-                <w:rFonts w:ascii="Arial" w:hAnsi="Arial" w:cs="Arial"/>
-              </w:rPr>
-            </w:pPr>
-            <w:r>
-              <w:rPr>
-                <w:rFonts w:ascii="Arial" w:hAnsi="Arial" w:cs="Arial"/>
-              </w:rPr>
-              <w:t>Strong gamification with leaderboards, points, and rewards for task completion</w:t>
-            </w:r>
-          </w:p>
-        </w:tc>
-        <w:tc>
-          <w:tcPr>
-            <w:tcW w:w="0" w:type="auto"/>
-            <w:vAlign w:val="center"/>
-            <w:hideMark/>
-          </w:tcPr>
-          <w:p>
-            <w:pPr>
-              <w:spacing w:line="360" w:lineRule="auto"/>
-              <w:rPr>
-                <w:rFonts w:ascii="Arial" w:hAnsi="Arial" w:cs="Arial"/>
-              </w:rPr>
-            </w:pPr>
-            <w:r>
-              <w:rPr>
-                <w:rFonts w:ascii="Arial" w:hAnsi="Arial" w:cs="Arial"/>
-              </w:rPr>
-              <w:t>No gamification, focuses on task management and organization</w:t>
-            </w:r>
-          </w:p>
-        </w:tc>
-        <w:tc>
-          <w:tcPr>
-            <w:tcW w:w="0" w:type="auto"/>
-            <w:vAlign w:val="center"/>
-            <w:hideMark/>
-          </w:tcPr>
-          <w:p>
-            <w:pPr>
-              <w:spacing w:line="360" w:lineRule="auto"/>
-              <w:rPr>
-                <w:rFonts w:ascii="Arial" w:hAnsi="Arial" w:cs="Arial"/>
-              </w:rPr>
-            </w:pPr>
-            <w:r>
-              <w:rPr>
-                <w:rFonts w:ascii="Arial" w:hAnsi="Arial" w:cs="Arial"/>
-              </w:rPr>
-              <w:t>No gamification; focuses on task management and project tracking</w:t>
-            </w:r>
-          </w:p>
-        </w:tc>
-        <w:tc>
-          <w:tcPr>
-            <w:tcW w:w="0" w:type="auto"/>
-            <w:vAlign w:val="center"/>
-            <w:hideMark/>
-          </w:tcPr>
-          <w:p>
-            <w:pPr>
-              <w:spacing w:line="360" w:lineRule="auto"/>
-              <w:rPr>
-                <w:rFonts w:ascii="Arial" w:hAnsi="Arial" w:cs="Arial"/>
-              </w:rPr>
-            </w:pPr>
-            <w:r>
-              <w:rPr>
-                <w:rFonts w:ascii="Arial" w:hAnsi="Arial" w:cs="Arial"/>
-              </w:rPr>
-              <w:t>No gamification; focuses on project and task management</w:t>
-            </w:r>
-          </w:p>
-        </w:tc>
-        <w:tc>
-          <w:tcPr>
-            <w:tcW w:w="0" w:type="auto"/>
-            <w:vAlign w:val="center"/>
-            <w:hideMark/>
-          </w:tcPr>
-          <w:p>
-            <w:pPr>
-              <w:spacing w:line="360" w:lineRule="auto"/>
-              <w:rPr>
-                <w:rFonts w:ascii="Arial" w:hAnsi="Arial" w:cs="Arial"/>
-              </w:rPr>
-            </w:pPr>
-            <w:r>
-              <w:rPr>
-                <w:rFonts w:ascii="Arial" w:hAnsi="Arial" w:cs="Arial"/>
-              </w:rPr>
-              <w:t>Gamification, but in the form of RPG elements and quests</w:t>
+                <w:b/>
+                <w:bCs/>
+              </w:rPr>
+              <w:t>Jira</w:t>
             </w:r>
           </w:p>
         </w:tc>
@@ -2492,6 +2566,7 @@
           <w:p>
             <w:pPr>
               <w:spacing w:line="360" w:lineRule="auto"/>
+              <w:jc w:val="both"/>
               <w:rPr>
                 <w:rFonts w:ascii="Arial" w:hAnsi="Arial" w:cs="Arial"/>
               </w:rPr>
@@ -2499,8 +2574,10 @@
             <w:r>
               <w:rPr>
                 <w:rFonts w:ascii="Arial" w:hAnsi="Arial" w:cs="Arial"/>
-              </w:rPr>
-              <w:t>KPI-Driven Approach</w:t>
+                <w:b/>
+                <w:bCs/>
+              </w:rPr>
+              <w:t>Gamification</w:t>
             </w:r>
           </w:p>
         </w:tc>
@@ -2513,6 +2590,7 @@
           <w:p>
             <w:pPr>
               <w:spacing w:line="360" w:lineRule="auto"/>
+              <w:jc w:val="both"/>
               <w:rPr>
                 <w:rFonts w:ascii="Arial" w:hAnsi="Arial" w:cs="Arial"/>
               </w:rPr>
@@ -2521,7 +2599,7 @@
               <w:rPr>
                 <w:rFonts w:ascii="Arial" w:hAnsi="Arial" w:cs="Arial"/>
               </w:rPr>
-              <w:t>Focuses on KPI tracking, offering insights into performance, trends, and progress predictions</w:t>
+              <w:t>Strong gamification with leaderboards, points, and rewards for task completion</w:t>
             </w:r>
           </w:p>
         </w:tc>
@@ -2534,6 +2612,7 @@
           <w:p>
             <w:pPr>
               <w:spacing w:line="360" w:lineRule="auto"/>
+              <w:jc w:val="both"/>
               <w:rPr>
                 <w:rFonts w:ascii="Arial" w:hAnsi="Arial" w:cs="Arial"/>
               </w:rPr>
@@ -2542,7 +2621,7 @@
               <w:rPr>
                 <w:rFonts w:ascii="Arial" w:hAnsi="Arial" w:cs="Arial"/>
               </w:rPr>
-              <w:t>Does not provide KPI tracking; focuses more on task organization and collaboration</w:t>
+              <w:t>No gamification, focuses on task management and organization</w:t>
             </w:r>
           </w:p>
         </w:tc>
@@ -2555,6 +2634,7 @@
           <w:p>
             <w:pPr>
               <w:spacing w:line="360" w:lineRule="auto"/>
+              <w:jc w:val="both"/>
               <w:rPr>
                 <w:rFonts w:ascii="Arial" w:hAnsi="Arial" w:cs="Arial"/>
               </w:rPr>
@@ -2563,7 +2643,7 @@
               <w:rPr>
                 <w:rFonts w:ascii="Arial" w:hAnsi="Arial" w:cs="Arial"/>
               </w:rPr>
-              <w:t>No KPI-based performance insights, only task management</w:t>
+              <w:t>No gamification; focuses on task management and project tracking</w:t>
             </w:r>
           </w:p>
         </w:tc>
@@ -2576,6 +2656,7 @@
           <w:p>
             <w:pPr>
               <w:spacing w:line="360" w:lineRule="auto"/>
+              <w:jc w:val="both"/>
               <w:rPr>
                 <w:rFonts w:ascii="Arial" w:hAnsi="Arial" w:cs="Arial"/>
               </w:rPr>
@@ -2584,7 +2665,7 @@
               <w:rPr>
                 <w:rFonts w:ascii="Arial" w:hAnsi="Arial" w:cs="Arial"/>
               </w:rPr>
-              <w:t>Lacks KPI-driven insights; focuses on team collaboration and project management</w:t>
+              <w:t>No gamification; focuses on project and task management</w:t>
             </w:r>
           </w:p>
         </w:tc>
@@ -2597,6 +2678,7 @@
           <w:p>
             <w:pPr>
               <w:spacing w:line="360" w:lineRule="auto"/>
+              <w:jc w:val="both"/>
               <w:rPr>
                 <w:rFonts w:ascii="Arial" w:hAnsi="Arial" w:cs="Arial"/>
               </w:rPr>
@@ -2605,7 +2687,7 @@
               <w:rPr>
                 <w:rFonts w:ascii="Arial" w:hAnsi="Arial" w:cs="Arial"/>
               </w:rPr>
-              <w:t>Does not have KPI tracking; focuses more on habit-building and RPG gamification</w:t>
+              <w:t>Minimal gamification (e.g., story points for tasks), primarily focuses on agile project management</w:t>
             </w:r>
           </w:p>
         </w:tc>
@@ -2623,6 +2705,7 @@
           <w:p>
             <w:pPr>
               <w:spacing w:line="360" w:lineRule="auto"/>
+              <w:jc w:val="both"/>
               <w:rPr>
                 <w:rFonts w:ascii="Arial" w:hAnsi="Arial" w:cs="Arial"/>
               </w:rPr>
@@ -2630,8 +2713,10 @@
             <w:r>
               <w:rPr>
                 <w:rFonts w:ascii="Arial" w:hAnsi="Arial" w:cs="Arial"/>
-              </w:rPr>
-              <w:t>Individual vs. Team Focus</w:t>
+                <w:b/>
+                <w:bCs/>
+              </w:rPr>
+              <w:t>KPI-Driven Approach</w:t>
             </w:r>
           </w:p>
         </w:tc>
@@ -2644,6 +2729,7 @@
           <w:p>
             <w:pPr>
               <w:spacing w:line="360" w:lineRule="auto"/>
+              <w:jc w:val="both"/>
               <w:rPr>
                 <w:rFonts w:ascii="Arial" w:hAnsi="Arial" w:cs="Arial"/>
               </w:rPr>
@@ -2652,7 +2738,7 @@
               <w:rPr>
                 <w:rFonts w:ascii="Arial" w:hAnsi="Arial" w:cs="Arial"/>
               </w:rPr>
-              <w:t>Primarily focuses on individual productivity and performance tracking</w:t>
+              <w:t>Focuses on KPI tracking, offering insights into performance, trends, and progress predictions</w:t>
             </w:r>
           </w:p>
         </w:tc>
@@ -2665,6 +2751,7 @@
           <w:p>
             <w:pPr>
               <w:spacing w:line="360" w:lineRule="auto"/>
+              <w:jc w:val="both"/>
               <w:rPr>
                 <w:rFonts w:ascii="Arial" w:hAnsi="Arial" w:cs="Arial"/>
               </w:rPr>
@@ -2673,7 +2760,7 @@
               <w:rPr>
                 <w:rFonts w:ascii="Arial" w:hAnsi="Arial" w:cs="Arial"/>
               </w:rPr>
-              <w:t>Primarily focuses on team collaboration with shared boards and tasks</w:t>
+              <w:t>Does not provide KPI tracking; focuses more on task organization and collaboration</w:t>
             </w:r>
           </w:p>
         </w:tc>
@@ -2686,6 +2773,7 @@
           <w:p>
             <w:pPr>
               <w:spacing w:line="360" w:lineRule="auto"/>
+              <w:jc w:val="both"/>
               <w:rPr>
                 <w:rFonts w:ascii="Arial" w:hAnsi="Arial" w:cs="Arial"/>
               </w:rPr>
@@ -2694,7 +2782,7 @@
               <w:rPr>
                 <w:rFonts w:ascii="Arial" w:hAnsi="Arial" w:cs="Arial"/>
               </w:rPr>
-              <w:t>Primarily individual task management with minimal team-oriented features</w:t>
+              <w:t>No KPI-based performance insights, only task management</w:t>
             </w:r>
           </w:p>
         </w:tc>
@@ -2707,6 +2795,7 @@
           <w:p>
             <w:pPr>
               <w:spacing w:line="360" w:lineRule="auto"/>
+              <w:jc w:val="both"/>
               <w:rPr>
                 <w:rFonts w:ascii="Arial" w:hAnsi="Arial" w:cs="Arial"/>
               </w:rPr>
@@ -2715,7 +2804,7 @@
               <w:rPr>
                 <w:rFonts w:ascii="Arial" w:hAnsi="Arial" w:cs="Arial"/>
               </w:rPr>
-              <w:t>Primarily focused on team collaboration and project timelines</w:t>
+              <w:t>Lacks KPI-driven insights; focuses on team collaboration and project management</w:t>
             </w:r>
           </w:p>
         </w:tc>
@@ -2728,6 +2817,7 @@
           <w:p>
             <w:pPr>
               <w:spacing w:line="360" w:lineRule="auto"/>
+              <w:jc w:val="both"/>
               <w:rPr>
                 <w:rFonts w:ascii="Arial" w:hAnsi="Arial" w:cs="Arial"/>
               </w:rPr>
@@ -2736,7 +2826,7 @@
               <w:rPr>
                 <w:rFonts w:ascii="Arial" w:hAnsi="Arial" w:cs="Arial"/>
               </w:rPr>
-              <w:t>Focuses on individuals turning tasks into game-like activities</w:t>
+              <w:t>Offers limited KPI tracking via custom reports and third-party integrations; focuses more on agile metrics like velocity</w:t>
             </w:r>
           </w:p>
         </w:tc>
@@ -2754,6 +2844,7 @@
           <w:p>
             <w:pPr>
               <w:spacing w:line="360" w:lineRule="auto"/>
+              <w:jc w:val="both"/>
               <w:rPr>
                 <w:rFonts w:ascii="Arial" w:hAnsi="Arial" w:cs="Arial"/>
               </w:rPr>
@@ -2761,8 +2852,10 @@
             <w:r>
               <w:rPr>
                 <w:rFonts w:ascii="Arial" w:hAnsi="Arial" w:cs="Arial"/>
-              </w:rPr>
-              <w:t>Progress Tracking &amp; Analytics</w:t>
+                <w:b/>
+                <w:bCs/>
+              </w:rPr>
+              <w:t>Individual vs. Team Focus</w:t>
             </w:r>
           </w:p>
         </w:tc>
@@ -2775,6 +2868,7 @@
           <w:p>
             <w:pPr>
               <w:spacing w:line="360" w:lineRule="auto"/>
+              <w:jc w:val="both"/>
               <w:rPr>
                 <w:rFonts w:ascii="Arial" w:hAnsi="Arial" w:cs="Arial"/>
               </w:rPr>
@@ -2783,14 +2877,7 @@
               <w:rPr>
                 <w:rFonts w:ascii="Arial" w:hAnsi="Arial" w:cs="Arial"/>
               </w:rPr>
-              <w:t xml:space="preserve">Offers detailed progress tracking with real-time insights, and trends to </w:t>
-            </w:r>
-            <w:r>
-              <w:rPr>
-                <w:rFonts w:ascii="Arial" w:hAnsi="Arial" w:cs="Arial"/>
-              </w:rPr>
-              <w:lastRenderedPageBreak/>
-              <w:t>optimize workflows</w:t>
+              <w:t>Primarily focuses on individual productivity and performance tracking</w:t>
             </w:r>
           </w:p>
         </w:tc>
@@ -2803,6 +2890,7 @@
           <w:p>
             <w:pPr>
               <w:spacing w:line="360" w:lineRule="auto"/>
+              <w:jc w:val="both"/>
               <w:rPr>
                 <w:rFonts w:ascii="Arial" w:hAnsi="Arial" w:cs="Arial"/>
               </w:rPr>
@@ -2811,15 +2899,7 @@
               <w:rPr>
                 <w:rFonts w:ascii="Arial" w:hAnsi="Arial" w:cs="Arial"/>
               </w:rPr>
-              <w:lastRenderedPageBreak/>
-              <w:t xml:space="preserve">Basic progress tracking (completed tasks) without </w:t>
-            </w:r>
-            <w:r>
-              <w:rPr>
-                <w:rFonts w:ascii="Arial" w:hAnsi="Arial" w:cs="Arial"/>
-              </w:rPr>
-              <w:lastRenderedPageBreak/>
-              <w:t>detailed analytics</w:t>
+              <w:t>Primarily focuses on team collaboration with shared boards and tasks</w:t>
             </w:r>
           </w:p>
         </w:tc>
@@ -2832,6 +2912,7 @@
           <w:p>
             <w:pPr>
               <w:spacing w:line="360" w:lineRule="auto"/>
+              <w:jc w:val="both"/>
               <w:rPr>
                 <w:rFonts w:ascii="Arial" w:hAnsi="Arial" w:cs="Arial"/>
               </w:rPr>
@@ -2840,15 +2921,7 @@
               <w:rPr>
                 <w:rFonts w:ascii="Arial" w:hAnsi="Arial" w:cs="Arial"/>
               </w:rPr>
-              <w:lastRenderedPageBreak/>
-              <w:t xml:space="preserve">Provides progress tracking but lacks detailed </w:t>
-            </w:r>
-            <w:r>
-              <w:rPr>
-                <w:rFonts w:ascii="Arial" w:hAnsi="Arial" w:cs="Arial"/>
-              </w:rPr>
-              <w:lastRenderedPageBreak/>
-              <w:t>performance analytics</w:t>
+              <w:t>Primarily individual task management with minimal team-oriented features</w:t>
             </w:r>
           </w:p>
         </w:tc>
@@ -2861,6 +2934,7 @@
           <w:p>
             <w:pPr>
               <w:spacing w:line="360" w:lineRule="auto"/>
+              <w:jc w:val="both"/>
               <w:rPr>
                 <w:rFonts w:ascii="Arial" w:hAnsi="Arial" w:cs="Arial"/>
               </w:rPr>
@@ -2869,15 +2943,7 @@
               <w:rPr>
                 <w:rFonts w:ascii="Arial" w:hAnsi="Arial" w:cs="Arial"/>
               </w:rPr>
-              <w:lastRenderedPageBreak/>
-              <w:t xml:space="preserve">Provides project and task completion tracking, but </w:t>
-            </w:r>
-            <w:r>
-              <w:rPr>
-                <w:rFonts w:ascii="Arial" w:hAnsi="Arial" w:cs="Arial"/>
-              </w:rPr>
-              <w:lastRenderedPageBreak/>
-              <w:t>lacks KPI-driven analytics</w:t>
+              <w:t>Primarily focused on team collaboration and project timelines</w:t>
             </w:r>
           </w:p>
         </w:tc>
@@ -2890,6 +2956,7 @@
           <w:p>
             <w:pPr>
               <w:spacing w:line="360" w:lineRule="auto"/>
+              <w:jc w:val="both"/>
               <w:rPr>
                 <w:rFonts w:ascii="Arial" w:hAnsi="Arial" w:cs="Arial"/>
               </w:rPr>
@@ -2898,15 +2965,7 @@
               <w:rPr>
                 <w:rFonts w:ascii="Arial" w:hAnsi="Arial" w:cs="Arial"/>
               </w:rPr>
-              <w:lastRenderedPageBreak/>
-              <w:t xml:space="preserve">Tracks progress as part of the RPG system, but not in terms of KPIs or </w:t>
-            </w:r>
-            <w:r>
-              <w:rPr>
-                <w:rFonts w:ascii="Arial" w:hAnsi="Arial" w:cs="Arial"/>
-              </w:rPr>
-              <w:lastRenderedPageBreak/>
-              <w:t>performance metrics</w:t>
+              <w:t>Primarily team-focused, tailored for agile workflows and software development teams</w:t>
             </w:r>
           </w:p>
         </w:tc>
@@ -2924,6 +2983,7 @@
           <w:p>
             <w:pPr>
               <w:spacing w:line="360" w:lineRule="auto"/>
+              <w:jc w:val="both"/>
               <w:rPr>
                 <w:rFonts w:ascii="Arial" w:hAnsi="Arial" w:cs="Arial"/>
               </w:rPr>
@@ -2931,9 +2991,10 @@
             <w:r>
               <w:rPr>
                 <w:rFonts w:ascii="Arial" w:hAnsi="Arial" w:cs="Arial"/>
-              </w:rPr>
-              <w:lastRenderedPageBreak/>
-              <w:t>Competition &amp; Engagement</w:t>
+                <w:b/>
+                <w:bCs/>
+              </w:rPr>
+              <w:t>Progress Tracking &amp; Analytics</w:t>
             </w:r>
           </w:p>
         </w:tc>
@@ -2946,6 +3007,7 @@
           <w:p>
             <w:pPr>
               <w:spacing w:line="360" w:lineRule="auto"/>
+              <w:jc w:val="both"/>
               <w:rPr>
                 <w:rFonts w:ascii="Arial" w:hAnsi="Arial" w:cs="Arial"/>
               </w:rPr>
@@ -2954,7 +3016,14 @@
               <w:rPr>
                 <w:rFonts w:ascii="Arial" w:hAnsi="Arial" w:cs="Arial"/>
               </w:rPr>
-              <w:t>Includes a live leaderboard to foster healthy competition among users</w:t>
+              <w:t xml:space="preserve">Offers detailed progress tracking with real-time insights, and trends to </w:t>
+            </w:r>
+            <w:r>
+              <w:rPr>
+                <w:rFonts w:ascii="Arial" w:hAnsi="Arial" w:cs="Arial"/>
+              </w:rPr>
+              <w:lastRenderedPageBreak/>
+              <w:t>optimize workflows</w:t>
             </w:r>
           </w:p>
         </w:tc>
@@ -2967,6 +3036,7 @@
           <w:p>
             <w:pPr>
               <w:spacing w:line="360" w:lineRule="auto"/>
+              <w:jc w:val="both"/>
               <w:rPr>
                 <w:rFonts w:ascii="Arial" w:hAnsi="Arial" w:cs="Arial"/>
               </w:rPr>
@@ -2975,7 +3045,8 @@
               <w:rPr>
                 <w:rFonts w:ascii="Arial" w:hAnsi="Arial" w:cs="Arial"/>
               </w:rPr>
-              <w:t>No competition or engagement features beyond collaborative boards</w:t>
+              <w:lastRenderedPageBreak/>
+              <w:t>Basic progress tracking (completed tasks) without detailed analytics</w:t>
             </w:r>
           </w:p>
         </w:tc>
@@ -2988,6 +3059,7 @@
           <w:p>
             <w:pPr>
               <w:spacing w:line="360" w:lineRule="auto"/>
+              <w:jc w:val="both"/>
               <w:rPr>
                 <w:rFonts w:ascii="Arial" w:hAnsi="Arial" w:cs="Arial"/>
               </w:rPr>
@@ -2996,7 +3068,7 @@
               <w:rPr>
                 <w:rFonts w:ascii="Arial" w:hAnsi="Arial" w:cs="Arial"/>
               </w:rPr>
-              <w:t>No competition or leaderboard system for user engagement</w:t>
+              <w:t>Provides progress tracking but lacks detailed performance analytics</w:t>
             </w:r>
           </w:p>
         </w:tc>
@@ -3009,6 +3081,7 @@
           <w:p>
             <w:pPr>
               <w:spacing w:line="360" w:lineRule="auto"/>
+              <w:jc w:val="both"/>
               <w:rPr>
                 <w:rFonts w:ascii="Arial" w:hAnsi="Arial" w:cs="Arial"/>
               </w:rPr>
@@ -3017,7 +3090,14 @@
               <w:rPr>
                 <w:rFonts w:ascii="Arial" w:hAnsi="Arial" w:cs="Arial"/>
               </w:rPr>
-              <w:t>No competitive features; focuses on team collaboration</w:t>
+              <w:t>Provides project and task completion tracking, but lacks KPI-</w:t>
+            </w:r>
+            <w:r>
+              <w:rPr>
+                <w:rFonts w:ascii="Arial" w:hAnsi="Arial" w:cs="Arial"/>
+              </w:rPr>
+              <w:lastRenderedPageBreak/>
+              <w:t>driven analytics</w:t>
             </w:r>
           </w:p>
         </w:tc>
@@ -3030,6 +3110,7 @@
           <w:p>
             <w:pPr>
               <w:spacing w:line="360" w:lineRule="auto"/>
+              <w:jc w:val="both"/>
               <w:rPr>
                 <w:rFonts w:ascii="Arial" w:hAnsi="Arial" w:cs="Arial"/>
               </w:rPr>
@@ -3038,7 +3119,8 @@
               <w:rPr>
                 <w:rFonts w:ascii="Arial" w:hAnsi="Arial" w:cs="Arial"/>
               </w:rPr>
-              <w:t>Focuses on cooperative challenges and achievements, but not competitive leaderboards</w:t>
+              <w:lastRenderedPageBreak/>
+              <w:t>Offers robust progress tracking for teams, including sprint metrics, burndown charts, and backlog tracking</w:t>
             </w:r>
           </w:p>
         </w:tc>
@@ -3056,6 +3138,7 @@
           <w:p>
             <w:pPr>
               <w:spacing w:line="360" w:lineRule="auto"/>
+              <w:jc w:val="both"/>
               <w:rPr>
                 <w:rFonts w:ascii="Arial" w:hAnsi="Arial" w:cs="Arial"/>
               </w:rPr>
@@ -3063,8 +3146,11 @@
             <w:r>
               <w:rPr>
                 <w:rFonts w:ascii="Arial" w:hAnsi="Arial" w:cs="Arial"/>
-              </w:rPr>
-              <w:t>Task Completion Rewards</w:t>
+                <w:b/>
+                <w:bCs/>
+              </w:rPr>
+              <w:lastRenderedPageBreak/>
+              <w:t>Competition &amp; Engagement</w:t>
             </w:r>
           </w:p>
         </w:tc>
@@ -3077,6 +3163,7 @@
           <w:p>
             <w:pPr>
               <w:spacing w:line="360" w:lineRule="auto"/>
+              <w:jc w:val="both"/>
               <w:rPr>
                 <w:rFonts w:ascii="Arial" w:hAnsi="Arial" w:cs="Arial"/>
               </w:rPr>
@@ -3085,7 +3172,7 @@
               <w:rPr>
                 <w:rFonts w:ascii="Arial" w:hAnsi="Arial" w:cs="Arial"/>
               </w:rPr>
-              <w:t>Users receive points and rewards for completing tasks, redeemable for meaningful incentives</w:t>
+              <w:t>Includes a live leaderboard to foster healthy competition among users</w:t>
             </w:r>
           </w:p>
         </w:tc>
@@ -3098,6 +3185,7 @@
           <w:p>
             <w:pPr>
               <w:spacing w:line="360" w:lineRule="auto"/>
+              <w:jc w:val="both"/>
               <w:rPr>
                 <w:rFonts w:ascii="Arial" w:hAnsi="Arial" w:cs="Arial"/>
               </w:rPr>
@@ -3106,7 +3194,7 @@
               <w:rPr>
                 <w:rFonts w:ascii="Arial" w:hAnsi="Arial" w:cs="Arial"/>
               </w:rPr>
-              <w:t>No reward system for task completion</w:t>
+              <w:t>No competition or engagement features beyond collaborative boards</w:t>
             </w:r>
           </w:p>
         </w:tc>
@@ -3119,6 +3207,7 @@
           <w:p>
             <w:pPr>
               <w:spacing w:line="360" w:lineRule="auto"/>
+              <w:jc w:val="both"/>
               <w:rPr>
                 <w:rFonts w:ascii="Arial" w:hAnsi="Arial" w:cs="Arial"/>
               </w:rPr>
@@ -3127,7 +3216,7 @@
               <w:rPr>
                 <w:rFonts w:ascii="Arial" w:hAnsi="Arial" w:cs="Arial"/>
               </w:rPr>
-              <w:t>No point system or rewards for task completion</w:t>
+              <w:t>No competition or leaderboard system for user engagement</w:t>
             </w:r>
           </w:p>
         </w:tc>
@@ -3140,6 +3229,7 @@
           <w:p>
             <w:pPr>
               <w:spacing w:line="360" w:lineRule="auto"/>
+              <w:jc w:val="both"/>
               <w:rPr>
                 <w:rFonts w:ascii="Arial" w:hAnsi="Arial" w:cs="Arial"/>
               </w:rPr>
@@ -3148,7 +3238,7 @@
               <w:rPr>
                 <w:rFonts w:ascii="Arial" w:hAnsi="Arial" w:cs="Arial"/>
               </w:rPr>
-              <w:t>No reward system for task completion</w:t>
+              <w:t>No competitive features; focuses on team collaboration</w:t>
             </w:r>
           </w:p>
         </w:tc>
@@ -3161,6 +3251,7 @@
           <w:p>
             <w:pPr>
               <w:spacing w:line="360" w:lineRule="auto"/>
+              <w:jc w:val="both"/>
               <w:rPr>
                 <w:rFonts w:ascii="Arial" w:hAnsi="Arial" w:cs="Arial"/>
               </w:rPr>
@@ -3169,7 +3260,7 @@
               <w:rPr>
                 <w:rFonts w:ascii="Arial" w:hAnsi="Arial" w:cs="Arial"/>
               </w:rPr>
-              <w:t>Reward system through in-game items and leveling up, but not related to productivity</w:t>
+              <w:t>No competitive features; focuses on team efficiency and task prioritization</w:t>
             </w:r>
           </w:p>
         </w:tc>
@@ -3187,6 +3278,7 @@
           <w:p>
             <w:pPr>
               <w:spacing w:line="360" w:lineRule="auto"/>
+              <w:jc w:val="both"/>
               <w:rPr>
                 <w:rFonts w:ascii="Arial" w:hAnsi="Arial" w:cs="Arial"/>
               </w:rPr>
@@ -3194,8 +3286,10 @@
             <w:r>
               <w:rPr>
                 <w:rFonts w:ascii="Arial" w:hAnsi="Arial" w:cs="Arial"/>
-              </w:rPr>
-              <w:t>Customization and Flexibility</w:t>
+                <w:b/>
+                <w:bCs/>
+              </w:rPr>
+              <w:t>Task Completion Rewards</w:t>
             </w:r>
           </w:p>
         </w:tc>
@@ -3208,6 +3302,7 @@
           <w:p>
             <w:pPr>
               <w:spacing w:line="360" w:lineRule="auto"/>
+              <w:jc w:val="both"/>
               <w:rPr>
                 <w:rFonts w:ascii="Arial" w:hAnsi="Arial" w:cs="Arial"/>
               </w:rPr>
@@ -3216,7 +3311,7 @@
               <w:rPr>
                 <w:rFonts w:ascii="Arial" w:hAnsi="Arial" w:cs="Arial"/>
               </w:rPr>
-              <w:t>Offers custom KPIs and personal performance metrics, with flexibility in tracking individual goals</w:t>
+              <w:t>Users receive points and rewards for completing tasks, redeemable for meaningful incentives</w:t>
             </w:r>
           </w:p>
         </w:tc>
@@ -3229,6 +3324,7 @@
           <w:p>
             <w:pPr>
               <w:spacing w:line="360" w:lineRule="auto"/>
+              <w:jc w:val="both"/>
               <w:rPr>
                 <w:rFonts w:ascii="Arial" w:hAnsi="Arial" w:cs="Arial"/>
               </w:rPr>
@@ -3237,7 +3333,7 @@
               <w:rPr>
                 <w:rFonts w:ascii="Arial" w:hAnsi="Arial" w:cs="Arial"/>
               </w:rPr>
-              <w:t>Offers flexibility in organizing tasks but no customization for individual performance tracking</w:t>
+              <w:t>No reward system for task completion</w:t>
             </w:r>
           </w:p>
         </w:tc>
@@ -3250,6 +3346,7 @@
           <w:p>
             <w:pPr>
               <w:spacing w:line="360" w:lineRule="auto"/>
+              <w:jc w:val="both"/>
               <w:rPr>
                 <w:rFonts w:ascii="Arial" w:hAnsi="Arial" w:cs="Arial"/>
               </w:rPr>
@@ -3258,7 +3355,7 @@
               <w:rPr>
                 <w:rFonts w:ascii="Arial" w:hAnsi="Arial" w:cs="Arial"/>
               </w:rPr>
-              <w:t>Offers task categorization, but no customization for tracking KPIs</w:t>
+              <w:t>No point system or rewards for task completion</w:t>
             </w:r>
           </w:p>
         </w:tc>
@@ -3271,6 +3368,7 @@
           <w:p>
             <w:pPr>
               <w:spacing w:line="360" w:lineRule="auto"/>
+              <w:jc w:val="both"/>
               <w:rPr>
                 <w:rFonts w:ascii="Arial" w:hAnsi="Arial" w:cs="Arial"/>
               </w:rPr>
@@ -3279,7 +3377,7 @@
               <w:rPr>
                 <w:rFonts w:ascii="Arial" w:hAnsi="Arial" w:cs="Arial"/>
               </w:rPr>
-              <w:t>Offers project customization, but lacks flexibility for individual goal tracking and KPIs</w:t>
+              <w:t>No reward system for task completion</w:t>
             </w:r>
           </w:p>
         </w:tc>
@@ -3292,6 +3390,7 @@
           <w:p>
             <w:pPr>
               <w:spacing w:line="360" w:lineRule="auto"/>
+              <w:jc w:val="both"/>
               <w:rPr>
                 <w:rFonts w:ascii="Arial" w:hAnsi="Arial" w:cs="Arial"/>
               </w:rPr>
@@ -3300,7 +3399,7 @@
               <w:rPr>
                 <w:rFonts w:ascii="Arial" w:hAnsi="Arial" w:cs="Arial"/>
               </w:rPr>
-              <w:t>Allows some customization in the RPG system, but not for KPI-driven task management</w:t>
+              <w:t>No reward system for task completion</w:t>
             </w:r>
           </w:p>
         </w:tc>
@@ -3318,6 +3417,7 @@
           <w:p>
             <w:pPr>
               <w:spacing w:line="360" w:lineRule="auto"/>
+              <w:jc w:val="both"/>
               <w:rPr>
                 <w:rFonts w:ascii="Arial" w:hAnsi="Arial" w:cs="Arial"/>
               </w:rPr>
@@ -3325,6 +3425,8 @@
             <w:r>
               <w:rPr>
                 <w:rFonts w:ascii="Arial" w:hAnsi="Arial" w:cs="Arial"/>
+                <w:b/>
+                <w:bCs/>
               </w:rPr>
               <w:t>Focus on Data-Driven Solutions</w:t>
             </w:r>
@@ -3339,6 +3441,7 @@
           <w:p>
             <w:pPr>
               <w:spacing w:line="360" w:lineRule="auto"/>
+              <w:jc w:val="both"/>
               <w:rPr>
                 <w:rFonts w:ascii="Arial" w:hAnsi="Arial" w:cs="Arial"/>
               </w:rPr>
@@ -3347,14 +3450,7 @@
               <w:rPr>
                 <w:rFonts w:ascii="Arial" w:hAnsi="Arial" w:cs="Arial"/>
               </w:rPr>
-              <w:t xml:space="preserve">Uses real-time data to optimize productivity </w:t>
-            </w:r>
-            <w:r>
-              <w:rPr>
-                <w:rFonts w:ascii="Arial" w:hAnsi="Arial" w:cs="Arial"/>
-              </w:rPr>
-              <w:lastRenderedPageBreak/>
-              <w:t>and task completion, offering actionable insights</w:t>
+              <w:t>Uses real-time data to optimize productivity and task completion, offering actionable insights</w:t>
             </w:r>
           </w:p>
         </w:tc>
@@ -3367,6 +3463,7 @@
           <w:p>
             <w:pPr>
               <w:spacing w:line="360" w:lineRule="auto"/>
+              <w:jc w:val="both"/>
               <w:rPr>
                 <w:rFonts w:ascii="Arial" w:hAnsi="Arial" w:cs="Arial"/>
               </w:rPr>
@@ -3375,15 +3472,7 @@
               <w:rPr>
                 <w:rFonts w:ascii="Arial" w:hAnsi="Arial" w:cs="Arial"/>
               </w:rPr>
-              <w:lastRenderedPageBreak/>
-              <w:t xml:space="preserve">Lacks a data-driven approach; focuses more </w:t>
-            </w:r>
-            <w:r>
-              <w:rPr>
-                <w:rFonts w:ascii="Arial" w:hAnsi="Arial" w:cs="Arial"/>
-              </w:rPr>
-              <w:lastRenderedPageBreak/>
-              <w:t>on visual task organization</w:t>
+              <w:t>Lacks a data-driven approach; focuses more on visual task organization</w:t>
             </w:r>
           </w:p>
         </w:tc>
@@ -3396,6 +3485,7 @@
           <w:p>
             <w:pPr>
               <w:spacing w:line="360" w:lineRule="auto"/>
+              <w:jc w:val="both"/>
               <w:rPr>
                 <w:rFonts w:ascii="Arial" w:hAnsi="Arial" w:cs="Arial"/>
               </w:rPr>
@@ -3404,15 +3494,7 @@
               <w:rPr>
                 <w:rFonts w:ascii="Arial" w:hAnsi="Arial" w:cs="Arial"/>
               </w:rPr>
-              <w:lastRenderedPageBreak/>
-              <w:t xml:space="preserve">Lacks advanced data-driven features; focuses on </w:t>
-            </w:r>
-            <w:r>
-              <w:rPr>
-                <w:rFonts w:ascii="Arial" w:hAnsi="Arial" w:cs="Arial"/>
-              </w:rPr>
-              <w:lastRenderedPageBreak/>
-              <w:t>task management</w:t>
+              <w:t>Lacks advanced data-driven features; focuses on task management</w:t>
             </w:r>
           </w:p>
         </w:tc>
@@ -3425,6 +3507,7 @@
           <w:p>
             <w:pPr>
               <w:spacing w:line="360" w:lineRule="auto"/>
+              <w:jc w:val="both"/>
               <w:rPr>
                 <w:rFonts w:ascii="Arial" w:hAnsi="Arial" w:cs="Arial"/>
               </w:rPr>
@@ -3433,15 +3516,7 @@
               <w:rPr>
                 <w:rFonts w:ascii="Arial" w:hAnsi="Arial" w:cs="Arial"/>
               </w:rPr>
-              <w:lastRenderedPageBreak/>
-              <w:t xml:space="preserve">Focuses on project tracking but lacks </w:t>
-            </w:r>
-            <w:r>
-              <w:rPr>
-                <w:rFonts w:ascii="Arial" w:hAnsi="Arial" w:cs="Arial"/>
-              </w:rPr>
-              <w:lastRenderedPageBreak/>
-              <w:t>advanced data-driven features</w:t>
+              <w:t>Focuses on project tracking but lacks advanced data-driven features</w:t>
             </w:r>
           </w:p>
         </w:tc>
@@ -3454,6 +3529,7 @@
           <w:p>
             <w:pPr>
               <w:spacing w:line="360" w:lineRule="auto"/>
+              <w:jc w:val="both"/>
               <w:rPr>
                 <w:rFonts w:ascii="Arial" w:hAnsi="Arial" w:cs="Arial"/>
               </w:rPr>
@@ -3462,15 +3538,7 @@
               <w:rPr>
                 <w:rFonts w:ascii="Arial" w:hAnsi="Arial" w:cs="Arial"/>
               </w:rPr>
-              <w:lastRenderedPageBreak/>
-              <w:t xml:space="preserve">Does not provide data insights or tracking </w:t>
-            </w:r>
-            <w:r>
-              <w:rPr>
-                <w:rFonts w:ascii="Arial" w:hAnsi="Arial" w:cs="Arial"/>
-              </w:rPr>
-              <w:lastRenderedPageBreak/>
-              <w:t>beyond game elements</w:t>
+              <w:t>Strong focus on agile metrics and reporting, but primarily designed for software development teams</w:t>
             </w:r>
           </w:p>
         </w:tc>
@@ -3488,6 +3556,7 @@
           <w:p>
             <w:pPr>
               <w:spacing w:line="360" w:lineRule="auto"/>
+              <w:jc w:val="both"/>
               <w:rPr>
                 <w:rFonts w:ascii="Arial" w:hAnsi="Arial" w:cs="Arial"/>
               </w:rPr>
@@ -3495,8 +3564,9 @@
             <w:r>
               <w:rPr>
                 <w:rFonts w:ascii="Arial" w:hAnsi="Arial" w:cs="Arial"/>
-              </w:rPr>
-              <w:lastRenderedPageBreak/>
+                <w:b/>
+                <w:bCs/>
+              </w:rPr>
               <w:t>Task Management View</w:t>
             </w:r>
           </w:p>
@@ -3510,6 +3580,7 @@
           <w:p>
             <w:pPr>
               <w:spacing w:line="360" w:lineRule="auto"/>
+              <w:jc w:val="both"/>
               <w:rPr>
                 <w:rFonts w:ascii="Arial" w:hAnsi="Arial" w:cs="Arial"/>
               </w:rPr>
@@ -3518,7 +3589,14 @@
               <w:rPr>
                 <w:rFonts w:ascii="Arial" w:hAnsi="Arial" w:cs="Arial"/>
               </w:rPr>
-              <w:t>Primarily a single-user interface focused on individual goals and tasks</w:t>
+              <w:t xml:space="preserve">Primarily a single-user interface focused on </w:t>
+            </w:r>
+            <w:r>
+              <w:rPr>
+                <w:rFonts w:ascii="Arial" w:hAnsi="Arial" w:cs="Arial"/>
+              </w:rPr>
+              <w:lastRenderedPageBreak/>
+              <w:t>individual goals and tasks</w:t>
             </w:r>
           </w:p>
         </w:tc>
@@ -3531,6 +3609,7 @@
           <w:p>
             <w:pPr>
               <w:spacing w:line="360" w:lineRule="auto"/>
+              <w:jc w:val="both"/>
               <w:rPr>
                 <w:rFonts w:ascii="Arial" w:hAnsi="Arial" w:cs="Arial"/>
               </w:rPr>
@@ -3539,7 +3618,15 @@
               <w:rPr>
                 <w:rFonts w:ascii="Arial" w:hAnsi="Arial" w:cs="Arial"/>
               </w:rPr>
-              <w:t>Primarily a team-based project management interface</w:t>
+              <w:lastRenderedPageBreak/>
+              <w:t xml:space="preserve">Primarily a team-based project </w:t>
+            </w:r>
+            <w:r>
+              <w:rPr>
+                <w:rFonts w:ascii="Arial" w:hAnsi="Arial" w:cs="Arial"/>
+              </w:rPr>
+              <w:lastRenderedPageBreak/>
+              <w:t>management interface</w:t>
             </w:r>
           </w:p>
         </w:tc>
@@ -3552,6 +3639,7 @@
           <w:p>
             <w:pPr>
               <w:spacing w:line="360" w:lineRule="auto"/>
+              <w:jc w:val="both"/>
               <w:rPr>
                 <w:rFonts w:ascii="Arial" w:hAnsi="Arial" w:cs="Arial"/>
               </w:rPr>
@@ -3560,7 +3648,15 @@
               <w:rPr>
                 <w:rFonts w:ascii="Arial" w:hAnsi="Arial" w:cs="Arial"/>
               </w:rPr>
-              <w:t>Primarily designed for individual use, with team collaboration features</w:t>
+              <w:lastRenderedPageBreak/>
+              <w:t xml:space="preserve">Primarily designed for individual use, with team </w:t>
+            </w:r>
+            <w:r>
+              <w:rPr>
+                <w:rFonts w:ascii="Arial" w:hAnsi="Arial" w:cs="Arial"/>
+              </w:rPr>
+              <w:lastRenderedPageBreak/>
+              <w:t>collaboration features</w:t>
             </w:r>
           </w:p>
         </w:tc>
@@ -3573,6 +3669,7 @@
           <w:p>
             <w:pPr>
               <w:spacing w:line="360" w:lineRule="auto"/>
+              <w:jc w:val="both"/>
               <w:rPr>
                 <w:rFonts w:ascii="Arial" w:hAnsi="Arial" w:cs="Arial"/>
               </w:rPr>
@@ -3581,7 +3678,15 @@
               <w:rPr>
                 <w:rFonts w:ascii="Arial" w:hAnsi="Arial" w:cs="Arial"/>
               </w:rPr>
-              <w:t>Focuses on team-based project management, tracking timelines and milestones</w:t>
+              <w:lastRenderedPageBreak/>
+              <w:t xml:space="preserve">Focuses on team-based project management, </w:t>
+            </w:r>
+            <w:r>
+              <w:rPr>
+                <w:rFonts w:ascii="Arial" w:hAnsi="Arial" w:cs="Arial"/>
+              </w:rPr>
+              <w:lastRenderedPageBreak/>
+              <w:t>tracking timelines and milestones</w:t>
             </w:r>
           </w:p>
         </w:tc>
@@ -3594,23 +3699,24 @@
           <w:p>
             <w:pPr>
               <w:spacing w:line="360" w:lineRule="auto"/>
+              <w:jc w:val="both"/>
               <w:rPr>
                 <w:rFonts w:ascii="Arial" w:hAnsi="Arial" w:cs="Arial"/>
               </w:rPr>
             </w:pPr>
-            <w:proofErr w:type="gramStart"/>
             <w:r>
               <w:rPr>
                 <w:rFonts w:ascii="Arial" w:hAnsi="Arial" w:cs="Arial"/>
               </w:rPr>
-              <w:t>Focuses</w:t>
+              <w:lastRenderedPageBreak/>
+              <w:t xml:space="preserve">Team-focused view with agile boards (scrum/kanban), </w:t>
             </w:r>
-            <w:proofErr w:type="gramEnd"/>
             <w:r>
               <w:rPr>
                 <w:rFonts w:ascii="Arial" w:hAnsi="Arial" w:cs="Arial"/>
               </w:rPr>
-              <w:t xml:space="preserve"> on personal task tracking through a gamified interface</w:t>
+              <w:lastRenderedPageBreak/>
+              <w:t>epics, and sprint planning</w:t>
             </w:r>
           </w:p>
         </w:tc>
@@ -3619,118 +3725,7 @@
     <w:p>
       <w:pPr>
         <w:spacing w:line="360" w:lineRule="auto"/>
-        <w:rPr>
-          <w:rFonts w:ascii="Arial" w:hAnsi="Arial" w:cs="Arial"/>
-        </w:rPr>
-      </w:pPr>
-    </w:p>
-    <w:p>
-      <w:pPr>
-        <w:spacing w:line="360" w:lineRule="auto"/>
-        <w:rPr>
-          <w:rFonts w:ascii="Arial" w:hAnsi="Arial" w:cs="Arial"/>
-        </w:rPr>
-      </w:pPr>
-    </w:p>
-    <w:p>
-      <w:pPr>
-        <w:spacing w:line="360" w:lineRule="auto"/>
-        <w:rPr>
-          <w:rFonts w:ascii="Arial" w:hAnsi="Arial" w:cs="Arial"/>
-        </w:rPr>
-      </w:pPr>
-    </w:p>
-    <w:p>
-      <w:pPr>
-        <w:spacing w:line="360" w:lineRule="auto"/>
-        <w:rPr>
-          <w:rFonts w:ascii="Arial" w:hAnsi="Arial" w:cs="Arial"/>
-        </w:rPr>
-      </w:pPr>
-    </w:p>
-    <w:p>
-      <w:pPr>
-        <w:spacing w:line="360" w:lineRule="auto"/>
-        <w:rPr>
-          <w:rFonts w:ascii="Arial" w:hAnsi="Arial" w:cs="Arial"/>
-        </w:rPr>
-      </w:pPr>
-    </w:p>
-    <w:p>
-      <w:pPr>
-        <w:spacing w:line="360" w:lineRule="auto"/>
-        <w:rPr>
-          <w:rFonts w:ascii="Arial" w:hAnsi="Arial" w:cs="Arial"/>
-        </w:rPr>
-      </w:pPr>
-    </w:p>
-    <w:p>
-      <w:pPr>
-        <w:spacing w:line="360" w:lineRule="auto"/>
-        <w:rPr>
-          <w:rFonts w:ascii="Arial" w:hAnsi="Arial" w:cs="Arial"/>
-        </w:rPr>
-      </w:pPr>
-    </w:p>
-    <w:p>
-      <w:pPr>
-        <w:spacing w:line="360" w:lineRule="auto"/>
-        <w:rPr>
-          <w:rFonts w:ascii="Arial" w:hAnsi="Arial" w:cs="Arial"/>
-        </w:rPr>
-      </w:pPr>
-    </w:p>
-    <w:p>
-      <w:pPr>
-        <w:spacing w:line="360" w:lineRule="auto"/>
-        <w:rPr>
-          <w:rFonts w:ascii="Arial" w:hAnsi="Arial" w:cs="Arial"/>
-        </w:rPr>
-      </w:pPr>
-    </w:p>
-    <w:p>
-      <w:pPr>
-        <w:spacing w:line="360" w:lineRule="auto"/>
-        <w:rPr>
-          <w:rFonts w:ascii="Arial" w:hAnsi="Arial" w:cs="Arial"/>
-        </w:rPr>
-      </w:pPr>
-    </w:p>
-    <w:p>
-      <w:pPr>
-        <w:spacing w:line="360" w:lineRule="auto"/>
-        <w:rPr>
-          <w:rFonts w:ascii="Arial" w:hAnsi="Arial" w:cs="Arial"/>
-        </w:rPr>
-      </w:pPr>
-    </w:p>
-    <w:p>
-      <w:pPr>
-        <w:spacing w:line="360" w:lineRule="auto"/>
-        <w:rPr>
-          <w:rFonts w:ascii="Arial" w:hAnsi="Arial" w:cs="Arial"/>
-        </w:rPr>
-      </w:pPr>
-    </w:p>
-    <w:p>
-      <w:pPr>
-        <w:spacing w:line="360" w:lineRule="auto"/>
-        <w:rPr>
-          <w:rFonts w:ascii="Arial" w:hAnsi="Arial" w:cs="Arial"/>
-        </w:rPr>
-      </w:pPr>
-    </w:p>
-    <w:p>
-      <w:pPr>
-        <w:spacing w:line="360" w:lineRule="auto"/>
-        <w:rPr>
-          <w:rFonts w:ascii="Arial" w:hAnsi="Arial" w:cs="Arial"/>
-        </w:rPr>
-      </w:pPr>
-    </w:p>
-    <w:p>
-      <w:pPr>
-        <w:spacing w:line="360" w:lineRule="auto"/>
+        <w:jc w:val="both"/>
         <w:rPr>
           <w:rFonts w:ascii="Arial" w:hAnsi="Arial" w:cs="Arial"/>
         </w:rPr>
@@ -3740,6 +3735,263 @@
           <w:rFonts w:ascii="Arial" w:hAnsi="Arial" w:cs="Arial"/>
         </w:rPr>
         <w:lastRenderedPageBreak/>
+        <w:br w:type="textWrapping" w:clear="all"/>
+      </w:r>
+      <w:r>
+        <w:rPr>
+          <w:rFonts w:ascii="Arial" w:hAnsi="Arial" w:cs="Arial"/>
+        </w:rPr>
+        <w:pict w14:anchorId="71513309">
+          <v:rect id="_x0000_i1027" style="width:0;height:1.5pt" o:hralign="center" o:hrstd="t" o:hr="t" fillcolor="#a0a0a0" stroked="f"/>
+        </w:pict>
+      </w:r>
+    </w:p>
+    <w:p>
+      <w:pPr>
+        <w:spacing w:line="360" w:lineRule="auto"/>
+        <w:jc w:val="both"/>
+        <w:rPr>
+          <w:rFonts w:ascii="Arial" w:hAnsi="Arial" w:cs="Arial"/>
+        </w:rPr>
+      </w:pPr>
+    </w:p>
+    <w:p>
+      <w:pPr>
+        <w:spacing w:line="360" w:lineRule="auto"/>
+        <w:jc w:val="both"/>
+        <w:rPr>
+          <w:rFonts w:ascii="Arial" w:hAnsi="Arial" w:cs="Arial"/>
+        </w:rPr>
+      </w:pPr>
+    </w:p>
+    <w:p>
+      <w:pPr>
+        <w:spacing w:line="360" w:lineRule="auto"/>
+        <w:jc w:val="both"/>
+        <w:rPr>
+          <w:rFonts w:ascii="Arial" w:hAnsi="Arial" w:cs="Arial"/>
+        </w:rPr>
+      </w:pPr>
+    </w:p>
+    <w:p>
+      <w:pPr>
+        <w:spacing w:line="360" w:lineRule="auto"/>
+        <w:jc w:val="both"/>
+        <w:rPr>
+          <w:rFonts w:ascii="Arial" w:hAnsi="Arial" w:cs="Arial"/>
+        </w:rPr>
+      </w:pPr>
+    </w:p>
+    <w:p>
+      <w:pPr>
+        <w:spacing w:line="360" w:lineRule="auto"/>
+        <w:jc w:val="both"/>
+        <w:rPr>
+          <w:rFonts w:ascii="Arial" w:hAnsi="Arial" w:cs="Arial"/>
+        </w:rPr>
+      </w:pPr>
+    </w:p>
+    <w:p>
+      <w:pPr>
+        <w:spacing w:line="360" w:lineRule="auto"/>
+        <w:jc w:val="both"/>
+        <w:rPr>
+          <w:rFonts w:ascii="Arial" w:hAnsi="Arial" w:cs="Arial"/>
+        </w:rPr>
+      </w:pPr>
+    </w:p>
+    <w:p>
+      <w:pPr>
+        <w:spacing w:line="360" w:lineRule="auto"/>
+        <w:jc w:val="both"/>
+        <w:rPr>
+          <w:rFonts w:ascii="Arial" w:hAnsi="Arial" w:cs="Arial"/>
+        </w:rPr>
+      </w:pPr>
+    </w:p>
+    <w:p>
+      <w:pPr>
+        <w:spacing w:line="360" w:lineRule="auto"/>
+        <w:jc w:val="both"/>
+        <w:rPr>
+          <w:rFonts w:ascii="Arial" w:hAnsi="Arial" w:cs="Arial"/>
+        </w:rPr>
+      </w:pPr>
+    </w:p>
+    <w:p>
+      <w:pPr>
+        <w:spacing w:line="360" w:lineRule="auto"/>
+        <w:jc w:val="both"/>
+        <w:rPr>
+          <w:rFonts w:ascii="Arial" w:hAnsi="Arial" w:cs="Arial"/>
+        </w:rPr>
+      </w:pPr>
+    </w:p>
+    <w:p>
+      <w:pPr>
+        <w:spacing w:line="360" w:lineRule="auto"/>
+        <w:jc w:val="both"/>
+        <w:rPr>
+          <w:rFonts w:ascii="Arial" w:hAnsi="Arial" w:cs="Arial"/>
+        </w:rPr>
+      </w:pPr>
+    </w:p>
+    <w:p>
+      <w:pPr>
+        <w:spacing w:line="360" w:lineRule="auto"/>
+        <w:jc w:val="both"/>
+        <w:rPr>
+          <w:rFonts w:ascii="Arial" w:hAnsi="Arial" w:cs="Arial"/>
+        </w:rPr>
+      </w:pPr>
+    </w:p>
+    <w:p>
+      <w:pPr>
+        <w:spacing w:line="360" w:lineRule="auto"/>
+        <w:jc w:val="both"/>
+        <w:rPr>
+          <w:rFonts w:ascii="Arial" w:hAnsi="Arial" w:cs="Arial"/>
+        </w:rPr>
+      </w:pPr>
+    </w:p>
+    <w:p>
+      <w:pPr>
+        <w:spacing w:line="360" w:lineRule="auto"/>
+        <w:jc w:val="both"/>
+        <w:rPr>
+          <w:rFonts w:ascii="Arial" w:hAnsi="Arial" w:cs="Arial"/>
+        </w:rPr>
+      </w:pPr>
+    </w:p>
+    <w:p>
+      <w:pPr>
+        <w:spacing w:line="360" w:lineRule="auto"/>
+        <w:jc w:val="both"/>
+        <w:rPr>
+          <w:rFonts w:ascii="Arial" w:hAnsi="Arial" w:cs="Arial"/>
+        </w:rPr>
+      </w:pPr>
+    </w:p>
+    <w:p>
+      <w:pPr>
+        <w:spacing w:line="360" w:lineRule="auto"/>
+        <w:jc w:val="both"/>
+        <w:rPr>
+          <w:rFonts w:ascii="Arial" w:hAnsi="Arial" w:cs="Arial"/>
+        </w:rPr>
+      </w:pPr>
+    </w:p>
+    <w:p>
+      <w:pPr>
+        <w:spacing w:line="360" w:lineRule="auto"/>
+        <w:jc w:val="both"/>
+        <w:rPr>
+          <w:rFonts w:ascii="Arial" w:hAnsi="Arial" w:cs="Arial"/>
+        </w:rPr>
+      </w:pPr>
+    </w:p>
+    <w:p>
+      <w:pPr>
+        <w:spacing w:line="360" w:lineRule="auto"/>
+        <w:jc w:val="both"/>
+        <w:rPr>
+          <w:rFonts w:ascii="Arial" w:hAnsi="Arial" w:cs="Arial"/>
+        </w:rPr>
+      </w:pPr>
+    </w:p>
+    <w:p>
+      <w:pPr>
+        <w:spacing w:line="360" w:lineRule="auto"/>
+        <w:jc w:val="both"/>
+        <w:rPr>
+          <w:rFonts w:ascii="Arial" w:hAnsi="Arial" w:cs="Arial"/>
+        </w:rPr>
+      </w:pPr>
+    </w:p>
+    <w:p>
+      <w:pPr>
+        <w:spacing w:line="360" w:lineRule="auto"/>
+        <w:jc w:val="both"/>
+        <w:rPr>
+          <w:rFonts w:ascii="Arial" w:hAnsi="Arial" w:cs="Arial"/>
+        </w:rPr>
+      </w:pPr>
+    </w:p>
+    <w:p>
+      <w:pPr>
+        <w:spacing w:line="360" w:lineRule="auto"/>
+        <w:jc w:val="both"/>
+        <w:rPr>
+          <w:rFonts w:ascii="Arial" w:hAnsi="Arial" w:cs="Arial"/>
+        </w:rPr>
+      </w:pPr>
+    </w:p>
+    <w:p>
+      <w:pPr>
+        <w:spacing w:line="360" w:lineRule="auto"/>
+        <w:jc w:val="both"/>
+        <w:rPr>
+          <w:rFonts w:ascii="Arial" w:hAnsi="Arial" w:cs="Arial"/>
+        </w:rPr>
+      </w:pPr>
+    </w:p>
+    <w:p>
+      <w:pPr>
+        <w:spacing w:line="360" w:lineRule="auto"/>
+        <w:jc w:val="both"/>
+        <w:rPr>
+          <w:rFonts w:ascii="Arial" w:hAnsi="Arial" w:cs="Arial"/>
+        </w:rPr>
+      </w:pPr>
+    </w:p>
+    <w:p>
+      <w:pPr>
+        <w:spacing w:line="360" w:lineRule="auto"/>
+        <w:jc w:val="both"/>
+        <w:rPr>
+          <w:rFonts w:ascii="Arial" w:hAnsi="Arial" w:cs="Arial"/>
+        </w:rPr>
+      </w:pPr>
+    </w:p>
+    <w:p>
+      <w:pPr>
+        <w:spacing w:line="360" w:lineRule="auto"/>
+        <w:jc w:val="both"/>
+        <w:rPr>
+          <w:rFonts w:ascii="Arial" w:hAnsi="Arial" w:cs="Arial"/>
+        </w:rPr>
+      </w:pPr>
+    </w:p>
+    <w:p>
+      <w:pPr>
+        <w:spacing w:line="360" w:lineRule="auto"/>
+        <w:jc w:val="both"/>
+        <w:rPr>
+          <w:rFonts w:ascii="Arial" w:hAnsi="Arial" w:cs="Arial"/>
+        </w:rPr>
+      </w:pPr>
+    </w:p>
+    <w:p>
+      <w:pPr>
+        <w:spacing w:line="360" w:lineRule="auto"/>
+        <w:jc w:val="both"/>
+        <w:rPr>
+          <w:rFonts w:ascii="Arial" w:hAnsi="Arial" w:cs="Arial"/>
+        </w:rPr>
+      </w:pPr>
+    </w:p>
+    <w:p>
+      <w:pPr>
+        <w:spacing w:line="360" w:lineRule="auto"/>
+        <w:jc w:val="both"/>
+        <w:rPr>
+          <w:rFonts w:ascii="Arial" w:hAnsi="Arial" w:cs="Arial"/>
+        </w:rPr>
+      </w:pPr>
+      <w:r>
+        <w:rPr>
+          <w:rFonts w:ascii="Arial" w:hAnsi="Arial" w:cs="Arial"/>
+        </w:rPr>
         <w:t>Key Dissimilarities of Sonic Points:</w:t>
       </w:r>
     </w:p>
@@ -3750,6 +4002,7 @@
           <w:numId w:val="15"/>
         </w:numPr>
         <w:spacing w:line="360" w:lineRule="auto"/>
+        <w:jc w:val="both"/>
         <w:rPr>
           <w:rFonts w:ascii="Arial" w:hAnsi="Arial" w:cs="Arial"/>
         </w:rPr>
@@ -3796,6 +4049,7 @@
           <w:numId w:val="15"/>
         </w:numPr>
         <w:spacing w:line="360" w:lineRule="auto"/>
+        <w:jc w:val="both"/>
         <w:rPr>
           <w:rFonts w:ascii="Arial" w:hAnsi="Arial" w:cs="Arial"/>
         </w:rPr>
@@ -3842,6 +4096,7 @@
           <w:numId w:val="15"/>
         </w:numPr>
         <w:spacing w:line="360" w:lineRule="auto"/>
+        <w:jc w:val="both"/>
         <w:rPr>
           <w:rFonts w:ascii="Arial" w:hAnsi="Arial" w:cs="Arial"/>
         </w:rPr>
@@ -3860,6 +4115,7 @@
           <w:numId w:val="15"/>
         </w:numPr>
         <w:spacing w:line="360" w:lineRule="auto"/>
+        <w:jc w:val="both"/>
         <w:rPr>
           <w:rFonts w:ascii="Arial" w:hAnsi="Arial" w:cs="Arial"/>
         </w:rPr>
@@ -3892,6 +4148,7 @@
           <w:numId w:val="15"/>
         </w:numPr>
         <w:spacing w:line="360" w:lineRule="auto"/>
+        <w:jc w:val="both"/>
         <w:rPr>
           <w:rFonts w:ascii="Arial" w:hAnsi="Arial" w:cs="Arial"/>
         </w:rPr>
@@ -3938,14 +4195,16 @@
           <w:numId w:val="15"/>
         </w:numPr>
         <w:spacing w:line="360" w:lineRule="auto"/>
-        <w:rPr>
-          <w:rFonts w:ascii="Arial" w:hAnsi="Arial" w:cs="Arial"/>
-        </w:rPr>
-      </w:pPr>
-      <w:r>
-        <w:rPr>
-          <w:rFonts w:ascii="Arial" w:hAnsi="Arial" w:cs="Arial"/>
-        </w:rPr>
+        <w:jc w:val="both"/>
+        <w:rPr>
+          <w:rFonts w:ascii="Arial" w:hAnsi="Arial" w:cs="Arial"/>
+        </w:rPr>
+      </w:pPr>
+      <w:r>
+        <w:rPr>
+          <w:rFonts w:ascii="Arial" w:hAnsi="Arial" w:cs="Arial"/>
+        </w:rPr>
+        <w:lastRenderedPageBreak/>
         <w:t xml:space="preserve">Data-Driven Decisions: Sonic Points </w:t>
       </w:r>
       <w:proofErr w:type="gramStart"/>
@@ -3984,6 +4243,7 @@
           <w:numId w:val="15"/>
         </w:numPr>
         <w:spacing w:line="360" w:lineRule="auto"/>
+        <w:jc w:val="both"/>
         <w:rPr>
           <w:rFonts w:ascii="Arial" w:hAnsi="Arial" w:cs="Arial"/>
         </w:rPr>
@@ -3998,23 +4258,24 @@
     <w:p>
       <w:pPr>
         <w:spacing w:line="360" w:lineRule="auto"/>
-        <w:rPr>
-          <w:rFonts w:ascii="Arial" w:hAnsi="Arial" w:cs="Arial"/>
-        </w:rPr>
-      </w:pPr>
-      <w:r>
-        <w:rPr>
-          <w:rFonts w:ascii="Arial" w:hAnsi="Arial" w:cs="Arial"/>
-        </w:rPr>
-        <w:lastRenderedPageBreak/>
+        <w:jc w:val="both"/>
+        <w:rPr>
+          <w:rFonts w:ascii="Arial" w:hAnsi="Arial" w:cs="Arial"/>
+        </w:rPr>
+      </w:pPr>
+      <w:r>
+        <w:rPr>
+          <w:rFonts w:ascii="Arial" w:hAnsi="Arial" w:cs="Arial"/>
+        </w:rPr>
         <w:pict w14:anchorId="7E50ED1E">
-          <v:rect id="_x0000_i1031" style="width:0;height:1.5pt" o:hralign="center" o:hrstd="t" o:hr="t" fillcolor="#a0a0a0" stroked="f"/>
+          <v:rect id="_x0000_i1028" style="width:0;height:1.5pt" o:hralign="center" o:hrstd="t" o:hr="t" fillcolor="#a0a0a0" stroked="f"/>
         </w:pict>
       </w:r>
     </w:p>
     <w:p>
       <w:pPr>
         <w:spacing w:line="360" w:lineRule="auto"/>
+        <w:jc w:val="both"/>
         <w:rPr>
           <w:rFonts w:ascii="Arial" w:hAnsi="Arial" w:cs="Arial"/>
         </w:rPr>
@@ -4029,6 +4290,7 @@
     <w:p>
       <w:pPr>
         <w:spacing w:line="360" w:lineRule="auto"/>
+        <w:jc w:val="both"/>
         <w:rPr>
           <w:rFonts w:ascii="Arial" w:hAnsi="Arial" w:cs="Arial"/>
         </w:rPr>
@@ -4057,46 +4319,52 @@
     <w:p>
       <w:pPr>
         <w:spacing w:line="360" w:lineRule="auto"/>
-        <w:rPr>
-          <w:rFonts w:ascii="Arial" w:hAnsi="Arial" w:cs="Arial"/>
-        </w:rPr>
-      </w:pPr>
-    </w:p>
-    <w:p>
-      <w:pPr>
-        <w:spacing w:line="360" w:lineRule="auto"/>
-        <w:rPr>
-          <w:rFonts w:ascii="Arial" w:hAnsi="Arial" w:cs="Arial"/>
-        </w:rPr>
-      </w:pPr>
-    </w:p>
-    <w:p>
-      <w:pPr>
-        <w:spacing w:line="360" w:lineRule="auto"/>
-        <w:rPr>
-          <w:rFonts w:ascii="Arial" w:hAnsi="Arial" w:cs="Arial"/>
-        </w:rPr>
-      </w:pPr>
-    </w:p>
-    <w:p>
-      <w:pPr>
-        <w:spacing w:line="360" w:lineRule="auto"/>
-        <w:rPr>
-          <w:rFonts w:ascii="Arial" w:hAnsi="Arial" w:cs="Arial"/>
-        </w:rPr>
-      </w:pPr>
-    </w:p>
-    <w:p>
-      <w:pPr>
-        <w:spacing w:line="360" w:lineRule="auto"/>
-        <w:rPr>
-          <w:rFonts w:ascii="Arial" w:hAnsi="Arial" w:cs="Arial"/>
-        </w:rPr>
-      </w:pPr>
-    </w:p>
-    <w:p>
-      <w:pPr>
-        <w:spacing w:line="360" w:lineRule="auto"/>
+        <w:jc w:val="both"/>
+        <w:rPr>
+          <w:rFonts w:ascii="Arial" w:hAnsi="Arial" w:cs="Arial"/>
+        </w:rPr>
+      </w:pPr>
+    </w:p>
+    <w:p>
+      <w:pPr>
+        <w:spacing w:line="360" w:lineRule="auto"/>
+        <w:jc w:val="both"/>
+        <w:rPr>
+          <w:rFonts w:ascii="Arial" w:hAnsi="Arial" w:cs="Arial"/>
+        </w:rPr>
+      </w:pPr>
+    </w:p>
+    <w:p>
+      <w:pPr>
+        <w:spacing w:line="360" w:lineRule="auto"/>
+        <w:jc w:val="both"/>
+        <w:rPr>
+          <w:rFonts w:ascii="Arial" w:hAnsi="Arial" w:cs="Arial"/>
+        </w:rPr>
+      </w:pPr>
+    </w:p>
+    <w:p>
+      <w:pPr>
+        <w:spacing w:line="360" w:lineRule="auto"/>
+        <w:jc w:val="both"/>
+        <w:rPr>
+          <w:rFonts w:ascii="Arial" w:hAnsi="Arial" w:cs="Arial"/>
+        </w:rPr>
+      </w:pPr>
+    </w:p>
+    <w:p>
+      <w:pPr>
+        <w:spacing w:line="360" w:lineRule="auto"/>
+        <w:jc w:val="both"/>
+        <w:rPr>
+          <w:rFonts w:ascii="Arial" w:hAnsi="Arial" w:cs="Arial"/>
+        </w:rPr>
+      </w:pPr>
+    </w:p>
+    <w:p>
+      <w:pPr>
+        <w:spacing w:line="360" w:lineRule="auto"/>
+        <w:jc w:val="both"/>
         <w:rPr>
           <w:rFonts w:ascii="Arial" w:hAnsi="Arial" w:cs="Arial"/>
         </w:rPr>

</xml_diff>